<commit_message>
add request page documentation
</commit_message>
<xml_diff>
--- a/tests/doc/test_cases.docx
+++ b/tests/doc/test_cases.docx
@@ -29,7 +29,6 @@
           <w:sz w:val="24"/>
         </w:rPr>
       </w:pPr>
-      <w:proofErr w:type="spellStart"/>
       <w:r>
         <w:rPr>
           <w:rFonts w:ascii="Times New Roman" w:hAnsi="Times New Roman" w:cs="Times New Roman"/>
@@ -38,7 +37,6 @@
         </w:rPr>
         <w:t>Config</w:t>
       </w:r>
-      <w:proofErr w:type="spellEnd"/>
     </w:p>
     <w:p>
       <w:pPr>
@@ -567,9 +565,272 @@
     </w:p>
     <w:p>
       <w:pPr>
-        <w:rPr>
-          <w:rFonts w:ascii="Times New Roman" w:hAnsi="Times New Roman" w:cs="Times New Roman"/>
-          <w:sz w:val="24"/>
+        <w:jc w:val="center"/>
+        <w:rPr>
+          <w:rFonts w:ascii="Times New Roman" w:hAnsi="Times New Roman" w:cs="Times New Roman"/>
+          <w:sz w:val="24"/>
+          <w:lang w:val="en-US"/>
+        </w:rPr>
+      </w:pPr>
+      <w:r>
+        <w:rPr>
+          <w:rFonts w:ascii="Times New Roman" w:hAnsi="Times New Roman" w:cs="Times New Roman"/>
+          <w:sz w:val="24"/>
+        </w:rPr>
+        <w:t xml:space="preserve">Тестирование </w:t>
+      </w:r>
+      <w:r>
+        <w:rPr>
+          <w:rFonts w:ascii="Times New Roman" w:hAnsi="Times New Roman" w:cs="Times New Roman"/>
+          <w:sz w:val="24"/>
+          <w:lang w:val="en-US"/>
+        </w:rPr>
+        <w:t>get_requester_page</w:t>
+      </w:r>
+    </w:p>
+    <w:tbl>
+      <w:tblPr>
+        <w:tblStyle w:val="a4"/>
+        <w:tblW w:w="0" w:type="auto"/>
+        <w:tblLook w:val="04A0" w:firstRow="1" w:lastRow="0" w:firstColumn="1" w:lastColumn="0" w:noHBand="0" w:noVBand="1"/>
+      </w:tblPr>
+      <w:tblGrid>
+        <w:gridCol w:w="3115"/>
+        <w:gridCol w:w="3115"/>
+        <w:gridCol w:w="3115"/>
+      </w:tblGrid>
+      <w:tr>
+        <w:tc>
+          <w:tcPr>
+            <w:tcW w:w="3115" w:type="dxa"/>
+            <w:shd w:val="clear" w:color="auto" w:fill="92D050"/>
+          </w:tcPr>
+          <w:p>
+            <w:pPr>
+              <w:rPr>
+                <w:rFonts w:ascii="Times New Roman" w:hAnsi="Times New Roman" w:cs="Times New Roman"/>
+                <w:sz w:val="24"/>
+              </w:rPr>
+            </w:pPr>
+            <w:r>
+              <w:rPr>
+                <w:rFonts w:ascii="Times New Roman" w:hAnsi="Times New Roman" w:cs="Times New Roman"/>
+                <w:sz w:val="24"/>
+              </w:rPr>
+              <w:t>Запрос</w:t>
+            </w:r>
+            <w:r>
+              <w:rPr>
+                <w:rFonts w:ascii="Times New Roman" w:hAnsi="Times New Roman" w:cs="Times New Roman"/>
+                <w:sz w:val="24"/>
+                <w:lang w:val="en-US"/>
+              </w:rPr>
+              <w:t xml:space="preserve"> </w:t>
+            </w:r>
+            <w:r>
+              <w:rPr>
+                <w:rFonts w:ascii="Times New Roman" w:hAnsi="Times New Roman" w:cs="Times New Roman"/>
+                <w:sz w:val="24"/>
+              </w:rPr>
+              <w:t>корректной страницы</w:t>
+            </w:r>
+          </w:p>
+        </w:tc>
+        <w:tc>
+          <w:tcPr>
+            <w:tcW w:w="3115" w:type="dxa"/>
+            <w:shd w:val="clear" w:color="auto" w:fill="92D050"/>
+          </w:tcPr>
+          <w:p>
+            <w:pPr>
+              <w:rPr>
+                <w:rFonts w:ascii="Times New Roman" w:hAnsi="Times New Roman" w:cs="Times New Roman"/>
+                <w:sz w:val="24"/>
+                <w:lang w:val="en-US"/>
+              </w:rPr>
+            </w:pPr>
+            <w:r>
+              <w:rPr>
+                <w:rFonts w:ascii="Times New Roman" w:hAnsi="Times New Roman" w:cs="Times New Roman"/>
+                <w:sz w:val="24"/>
+                <w:lang w:val="en-US"/>
+              </w:rPr>
+              <w:t xml:space="preserve">1. </w:t>
+            </w:r>
+            <w:r>
+              <w:rPr>
+                <w:rFonts w:ascii="Times New Roman" w:hAnsi="Times New Roman" w:cs="Times New Roman"/>
+                <w:sz w:val="24"/>
+              </w:rPr>
+              <w:t>Вызывать</w:t>
+            </w:r>
+            <w:r>
+              <w:rPr>
+                <w:rFonts w:ascii="Times New Roman" w:hAnsi="Times New Roman" w:cs="Times New Roman"/>
+                <w:sz w:val="24"/>
+                <w:lang w:val="en-US"/>
+              </w:rPr>
+              <w:t xml:space="preserve"> </w:t>
+            </w:r>
+            <w:r>
+              <w:rPr>
+                <w:rFonts w:ascii="Times New Roman" w:hAnsi="Times New Roman" w:cs="Times New Roman"/>
+                <w:sz w:val="24"/>
+                <w:lang w:val="en-US"/>
+              </w:rPr>
+              <w:t>get_requester_page(url)</w:t>
+            </w:r>
+          </w:p>
+        </w:tc>
+        <w:tc>
+          <w:tcPr>
+            <w:tcW w:w="3115" w:type="dxa"/>
+            <w:shd w:val="clear" w:color="auto" w:fill="92D050"/>
+          </w:tcPr>
+          <w:p>
+            <w:pPr>
+              <w:rPr>
+                <w:rFonts w:ascii="Times New Roman" w:hAnsi="Times New Roman" w:cs="Times New Roman"/>
+                <w:sz w:val="24"/>
+              </w:rPr>
+            </w:pPr>
+            <w:r>
+              <w:rPr>
+                <w:rFonts w:ascii="Times New Roman" w:hAnsi="Times New Roman" w:cs="Times New Roman"/>
+                <w:sz w:val="24"/>
+              </w:rPr>
+              <w:t>Возвращается объект страницы (</w:t>
+            </w:r>
+            <w:r>
+              <w:rPr>
+                <w:rFonts w:ascii="Times New Roman" w:hAnsi="Times New Roman" w:cs="Times New Roman"/>
+                <w:sz w:val="24"/>
+                <w:lang w:val="en-US"/>
+              </w:rPr>
+              <w:t>bs4</w:t>
+            </w:r>
+            <w:r>
+              <w:rPr>
+                <w:rFonts w:ascii="Times New Roman" w:hAnsi="Times New Roman" w:cs="Times New Roman"/>
+                <w:sz w:val="24"/>
+              </w:rPr>
+              <w:t>)</w:t>
+            </w:r>
+          </w:p>
+        </w:tc>
+      </w:tr>
+      <w:tr>
+        <w:tc>
+          <w:tcPr>
+            <w:tcW w:w="3115" w:type="dxa"/>
+            <w:shd w:val="clear" w:color="auto" w:fill="92D050"/>
+          </w:tcPr>
+          <w:p>
+            <w:pPr>
+              <w:rPr>
+                <w:rFonts w:ascii="Times New Roman" w:hAnsi="Times New Roman" w:cs="Times New Roman"/>
+                <w:sz w:val="24"/>
+              </w:rPr>
+            </w:pPr>
+            <w:r>
+              <w:rPr>
+                <w:rFonts w:ascii="Times New Roman" w:hAnsi="Times New Roman" w:cs="Times New Roman"/>
+                <w:sz w:val="24"/>
+              </w:rPr>
+              <w:t>Запрос некорректной страницы</w:t>
+            </w:r>
+          </w:p>
+        </w:tc>
+        <w:tc>
+          <w:tcPr>
+            <w:tcW w:w="3115" w:type="dxa"/>
+            <w:shd w:val="clear" w:color="auto" w:fill="92D050"/>
+          </w:tcPr>
+          <w:p>
+            <w:pPr>
+              <w:rPr>
+                <w:rFonts w:ascii="Times New Roman" w:hAnsi="Times New Roman" w:cs="Times New Roman"/>
+                <w:sz w:val="24"/>
+              </w:rPr>
+            </w:pPr>
+            <w:r>
+              <w:rPr>
+                <w:rFonts w:ascii="Times New Roman" w:hAnsi="Times New Roman" w:cs="Times New Roman"/>
+                <w:sz w:val="24"/>
+                <w:lang w:val="en-US"/>
+              </w:rPr>
+              <w:t xml:space="preserve">1. </w:t>
+            </w:r>
+            <w:r>
+              <w:rPr>
+                <w:rFonts w:ascii="Times New Roman" w:hAnsi="Times New Roman" w:cs="Times New Roman"/>
+                <w:sz w:val="24"/>
+              </w:rPr>
+              <w:t>Вызывать</w:t>
+            </w:r>
+            <w:r>
+              <w:rPr>
+                <w:rFonts w:ascii="Times New Roman" w:hAnsi="Times New Roman" w:cs="Times New Roman"/>
+                <w:sz w:val="24"/>
+                <w:lang w:val="en-US"/>
+              </w:rPr>
+              <w:t xml:space="preserve"> get_requester_page(url)</w:t>
+            </w:r>
+            <w:r>
+              <w:rPr>
+                <w:rFonts w:ascii="Times New Roman" w:hAnsi="Times New Roman" w:cs="Times New Roman"/>
+                <w:sz w:val="24"/>
+              </w:rPr>
+              <w:t xml:space="preserve"> с неверным </w:t>
+            </w:r>
+            <w:r>
+              <w:rPr>
+                <w:rFonts w:ascii="Times New Roman" w:hAnsi="Times New Roman" w:cs="Times New Roman"/>
+                <w:sz w:val="24"/>
+                <w:lang w:val="en-US"/>
+              </w:rPr>
+              <w:t>URL</w:t>
+            </w:r>
+          </w:p>
+        </w:tc>
+        <w:tc>
+          <w:tcPr>
+            <w:tcW w:w="3115" w:type="dxa"/>
+            <w:shd w:val="clear" w:color="auto" w:fill="92D050"/>
+          </w:tcPr>
+          <w:p>
+            <w:pPr>
+              <w:rPr>
+                <w:rFonts w:ascii="Times New Roman" w:hAnsi="Times New Roman" w:cs="Times New Roman"/>
+                <w:sz w:val="24"/>
+              </w:rPr>
+            </w:pPr>
+            <w:r>
+              <w:rPr>
+                <w:rFonts w:ascii="Times New Roman" w:hAnsi="Times New Roman" w:cs="Times New Roman"/>
+                <w:sz w:val="24"/>
+              </w:rPr>
+              <w:t>Возникает ошибка запроса</w:t>
+            </w:r>
+          </w:p>
+        </w:tc>
+      </w:tr>
+    </w:tbl>
+    <w:p>
+      <w:pPr>
+        <w:rPr>
+          <w:rFonts w:ascii="Times New Roman" w:hAnsi="Times New Roman" w:cs="Times New Roman"/>
+          <w:sz w:val="24"/>
+          <w:lang w:val="en-US"/>
+        </w:rPr>
+      </w:pPr>
+    </w:p>
+    <w:p>
+      <w:pPr>
+        <w:rPr>
+          <w:rFonts w:ascii="Times New Roman" w:hAnsi="Times New Roman" w:cs="Times New Roman"/>
+          <w:sz w:val="24"/>
+          <w:lang w:val="en-US"/>
         </w:rPr>
       </w:pPr>
       <w:bookmarkStart w:id="0" w:name="_GoBack"/>

</xml_diff>

<commit_message>
add test comments documentation
</commit_message>
<xml_diff>
--- a/tests/doc/test_cases.docx
+++ b/tests/doc/test_cases.docx
@@ -827,10 +827,425 @@
     </w:p>
     <w:p>
       <w:pPr>
+        <w:jc w:val="center"/>
         <w:rPr>
           <w:rFonts w:ascii="Times New Roman" w:hAnsi="Times New Roman" w:cs="Times New Roman"/>
           <w:sz w:val="24"/>
           <w:lang w:val="en-US"/>
+        </w:rPr>
+      </w:pPr>
+      <w:r>
+        <w:rPr>
+          <w:rFonts w:ascii="Times New Roman" w:hAnsi="Times New Roman" w:cs="Times New Roman"/>
+          <w:sz w:val="24"/>
+        </w:rPr>
+        <w:t xml:space="preserve">Тестирование </w:t>
+      </w:r>
+      <w:proofErr w:type="spellStart"/>
+      <w:r>
+        <w:rPr>
+          <w:rFonts w:ascii="Times New Roman" w:hAnsi="Times New Roman" w:cs="Times New Roman"/>
+          <w:sz w:val="24"/>
+          <w:lang w:val="en-US"/>
+        </w:rPr>
+        <w:t>get_comments</w:t>
+      </w:r>
+      <w:proofErr w:type="spellEnd"/>
+    </w:p>
+    <w:tbl>
+      <w:tblPr>
+        <w:tblStyle w:val="a4"/>
+        <w:tblW w:w="0" w:type="auto"/>
+        <w:tblLook w:val="04A0" w:firstRow="1" w:lastRow="0" w:firstColumn="1" w:lastColumn="0" w:noHBand="0" w:noVBand="1"/>
+      </w:tblPr>
+      <w:tblGrid>
+        <w:gridCol w:w="3115"/>
+        <w:gridCol w:w="3115"/>
+        <w:gridCol w:w="3115"/>
+      </w:tblGrid>
+      <w:tr>
+        <w:tc>
+          <w:tcPr>
+            <w:tcW w:w="3115" w:type="dxa"/>
+            <w:shd w:val="clear" w:color="auto" w:fill="92D050"/>
+          </w:tcPr>
+          <w:p>
+            <w:pPr>
+              <w:rPr>
+                <w:rFonts w:ascii="Times New Roman" w:hAnsi="Times New Roman" w:cs="Times New Roman"/>
+                <w:sz w:val="24"/>
+              </w:rPr>
+            </w:pPr>
+            <w:r>
+              <w:rPr>
+                <w:rFonts w:ascii="Times New Roman" w:hAnsi="Times New Roman" w:cs="Times New Roman"/>
+                <w:sz w:val="24"/>
+              </w:rPr>
+              <w:t>Страница содержит комментарии и заголовок</w:t>
+            </w:r>
+          </w:p>
+        </w:tc>
+        <w:tc>
+          <w:tcPr>
+            <w:tcW w:w="3115" w:type="dxa"/>
+            <w:shd w:val="clear" w:color="auto" w:fill="92D050"/>
+          </w:tcPr>
+          <w:p>
+            <w:pPr>
+              <w:rPr>
+                <w:rFonts w:ascii="Times New Roman" w:hAnsi="Times New Roman" w:cs="Times New Roman"/>
+                <w:sz w:val="24"/>
+              </w:rPr>
+            </w:pPr>
+            <w:r>
+              <w:rPr>
+                <w:rFonts w:ascii="Times New Roman" w:hAnsi="Times New Roman" w:cs="Times New Roman"/>
+                <w:sz w:val="24"/>
+              </w:rPr>
+              <w:t xml:space="preserve">1. Передать страницу с комментариями в </w:t>
+            </w:r>
+            <w:r>
+              <w:rPr>
+                <w:rFonts w:ascii="Times New Roman" w:hAnsi="Times New Roman" w:cs="Times New Roman"/>
+                <w:sz w:val="24"/>
+                <w:lang w:val="en-US"/>
+              </w:rPr>
+              <w:t>get</w:t>
+            </w:r>
+            <w:r>
+              <w:rPr>
+                <w:rFonts w:ascii="Times New Roman" w:hAnsi="Times New Roman" w:cs="Times New Roman"/>
+                <w:sz w:val="24"/>
+              </w:rPr>
+              <w:t>_</w:t>
+            </w:r>
+            <w:proofErr w:type="gramStart"/>
+            <w:r>
+              <w:rPr>
+                <w:rFonts w:ascii="Times New Roman" w:hAnsi="Times New Roman" w:cs="Times New Roman"/>
+                <w:sz w:val="24"/>
+                <w:lang w:val="en-US"/>
+              </w:rPr>
+              <w:t>comments</w:t>
+            </w:r>
+            <w:r>
+              <w:rPr>
+                <w:rFonts w:ascii="Times New Roman" w:hAnsi="Times New Roman" w:cs="Times New Roman"/>
+                <w:sz w:val="24"/>
+              </w:rPr>
+              <w:t>(</w:t>
+            </w:r>
+            <w:proofErr w:type="gramEnd"/>
+            <w:r>
+              <w:rPr>
+                <w:rFonts w:ascii="Times New Roman" w:hAnsi="Times New Roman" w:cs="Times New Roman"/>
+                <w:sz w:val="24"/>
+              </w:rPr>
+              <w:t>)</w:t>
+            </w:r>
+          </w:p>
+        </w:tc>
+        <w:tc>
+          <w:tcPr>
+            <w:tcW w:w="3115" w:type="dxa"/>
+            <w:shd w:val="clear" w:color="auto" w:fill="92D050"/>
+          </w:tcPr>
+          <w:p>
+            <w:pPr>
+              <w:rPr>
+                <w:rFonts w:ascii="Times New Roman" w:hAnsi="Times New Roman" w:cs="Times New Roman"/>
+                <w:sz w:val="24"/>
+              </w:rPr>
+            </w:pPr>
+            <w:r>
+              <w:rPr>
+                <w:rFonts w:ascii="Times New Roman" w:hAnsi="Times New Roman" w:cs="Times New Roman"/>
+                <w:sz w:val="24"/>
+              </w:rPr>
+              <w:t>Возвращается словарь с заголовком статьи и списком комментариев</w:t>
+            </w:r>
+          </w:p>
+        </w:tc>
+      </w:tr>
+      <w:tr>
+        <w:tc>
+          <w:tcPr>
+            <w:tcW w:w="3115" w:type="dxa"/>
+            <w:shd w:val="clear" w:color="auto" w:fill="92D050"/>
+          </w:tcPr>
+          <w:p>
+            <w:pPr>
+              <w:rPr>
+                <w:rFonts w:ascii="Times New Roman" w:hAnsi="Times New Roman" w:cs="Times New Roman"/>
+                <w:sz w:val="24"/>
+              </w:rPr>
+            </w:pPr>
+            <w:r>
+              <w:rPr>
+                <w:rFonts w:ascii="Times New Roman" w:hAnsi="Times New Roman" w:cs="Times New Roman"/>
+                <w:sz w:val="24"/>
+              </w:rPr>
+              <w:t>Страница не содержит комментарии</w:t>
+            </w:r>
+          </w:p>
+        </w:tc>
+        <w:tc>
+          <w:tcPr>
+            <w:tcW w:w="3115" w:type="dxa"/>
+            <w:shd w:val="clear" w:color="auto" w:fill="92D050"/>
+          </w:tcPr>
+          <w:p>
+            <w:pPr>
+              <w:rPr>
+                <w:rFonts w:ascii="Times New Roman" w:hAnsi="Times New Roman" w:cs="Times New Roman"/>
+                <w:sz w:val="24"/>
+              </w:rPr>
+            </w:pPr>
+            <w:r>
+              <w:rPr>
+                <w:rFonts w:ascii="Times New Roman" w:hAnsi="Times New Roman" w:cs="Times New Roman"/>
+                <w:sz w:val="24"/>
+              </w:rPr>
+              <w:t xml:space="preserve">1. Передать страницу без комментариев в </w:t>
+            </w:r>
+            <w:r>
+              <w:rPr>
+                <w:rFonts w:ascii="Times New Roman" w:hAnsi="Times New Roman" w:cs="Times New Roman"/>
+                <w:sz w:val="24"/>
+                <w:lang w:val="en-US"/>
+              </w:rPr>
+              <w:t>get</w:t>
+            </w:r>
+            <w:r>
+              <w:rPr>
+                <w:rFonts w:ascii="Times New Roman" w:hAnsi="Times New Roman" w:cs="Times New Roman"/>
+                <w:sz w:val="24"/>
+              </w:rPr>
+              <w:t>_</w:t>
+            </w:r>
+            <w:proofErr w:type="gramStart"/>
+            <w:r>
+              <w:rPr>
+                <w:rFonts w:ascii="Times New Roman" w:hAnsi="Times New Roman" w:cs="Times New Roman"/>
+                <w:sz w:val="24"/>
+                <w:lang w:val="en-US"/>
+              </w:rPr>
+              <w:t>comments</w:t>
+            </w:r>
+            <w:r>
+              <w:rPr>
+                <w:rFonts w:ascii="Times New Roman" w:hAnsi="Times New Roman" w:cs="Times New Roman"/>
+                <w:sz w:val="24"/>
+              </w:rPr>
+              <w:t>(</w:t>
+            </w:r>
+            <w:proofErr w:type="gramEnd"/>
+            <w:r>
+              <w:rPr>
+                <w:rFonts w:ascii="Times New Roman" w:hAnsi="Times New Roman" w:cs="Times New Roman"/>
+                <w:sz w:val="24"/>
+              </w:rPr>
+              <w:t>)</w:t>
+            </w:r>
+          </w:p>
+        </w:tc>
+        <w:tc>
+          <w:tcPr>
+            <w:tcW w:w="3115" w:type="dxa"/>
+            <w:shd w:val="clear" w:color="auto" w:fill="92D050"/>
+          </w:tcPr>
+          <w:p>
+            <w:pPr>
+              <w:rPr>
+                <w:rFonts w:ascii="Times New Roman" w:hAnsi="Times New Roman" w:cs="Times New Roman"/>
+                <w:sz w:val="24"/>
+                <w:lang w:val="en-US"/>
+              </w:rPr>
+            </w:pPr>
+            <w:r>
+              <w:rPr>
+                <w:rFonts w:ascii="Times New Roman" w:hAnsi="Times New Roman" w:cs="Times New Roman"/>
+                <w:sz w:val="24"/>
+              </w:rPr>
+              <w:t>Список</w:t>
+            </w:r>
+            <w:r>
+              <w:rPr>
+                <w:rFonts w:ascii="Times New Roman" w:hAnsi="Times New Roman" w:cs="Times New Roman"/>
+                <w:sz w:val="24"/>
+                <w:lang w:val="en-US"/>
+              </w:rPr>
+              <w:t xml:space="preserve"> </w:t>
+            </w:r>
+            <w:proofErr w:type="spellStart"/>
+            <w:r>
+              <w:rPr>
+                <w:rFonts w:ascii="Times New Roman" w:hAnsi="Times New Roman" w:cs="Times New Roman"/>
+                <w:sz w:val="24"/>
+                <w:lang w:val="en-US"/>
+              </w:rPr>
+              <w:t>Comment_texts</w:t>
+            </w:r>
+            <w:proofErr w:type="spellEnd"/>
+            <w:r>
+              <w:rPr>
+                <w:rFonts w:ascii="Times New Roman" w:hAnsi="Times New Roman" w:cs="Times New Roman"/>
+                <w:sz w:val="24"/>
+                <w:lang w:val="en-US"/>
+              </w:rPr>
+              <w:t xml:space="preserve"> </w:t>
+            </w:r>
+            <w:r>
+              <w:rPr>
+                <w:rFonts w:ascii="Times New Roman" w:hAnsi="Times New Roman" w:cs="Times New Roman"/>
+                <w:sz w:val="24"/>
+              </w:rPr>
+              <w:t>пустой</w:t>
+            </w:r>
+            <w:r>
+              <w:rPr>
+                <w:rFonts w:ascii="Times New Roman" w:hAnsi="Times New Roman" w:cs="Times New Roman"/>
+                <w:sz w:val="24"/>
+                <w:lang w:val="en-US"/>
+              </w:rPr>
+              <w:t xml:space="preserve">, </w:t>
+            </w:r>
+            <w:r>
+              <w:rPr>
+                <w:rFonts w:ascii="Times New Roman" w:hAnsi="Times New Roman" w:cs="Times New Roman"/>
+                <w:sz w:val="24"/>
+                <w:lang w:val="en-US"/>
+              </w:rPr>
+              <w:t xml:space="preserve">Article </w:t>
+            </w:r>
+            <w:r>
+              <w:rPr>
+                <w:rFonts w:ascii="Times New Roman" w:hAnsi="Times New Roman" w:cs="Times New Roman"/>
+                <w:sz w:val="24"/>
+              </w:rPr>
+              <w:t>есть</w:t>
+            </w:r>
+          </w:p>
+        </w:tc>
+      </w:tr>
+      <w:tr>
+        <w:tc>
+          <w:tcPr>
+            <w:tcW w:w="3115" w:type="dxa"/>
+            <w:shd w:val="clear" w:color="auto" w:fill="92D050"/>
+          </w:tcPr>
+          <w:p>
+            <w:pPr>
+              <w:rPr>
+                <w:rFonts w:ascii="Times New Roman" w:hAnsi="Times New Roman" w:cs="Times New Roman"/>
+                <w:sz w:val="24"/>
+              </w:rPr>
+            </w:pPr>
+            <w:r>
+              <w:rPr>
+                <w:rFonts w:ascii="Times New Roman" w:hAnsi="Times New Roman" w:cs="Times New Roman"/>
+                <w:sz w:val="24"/>
+              </w:rPr>
+              <w:t>Страница не содержит заголовка статьи</w:t>
+            </w:r>
+          </w:p>
+        </w:tc>
+        <w:tc>
+          <w:tcPr>
+            <w:tcW w:w="3115" w:type="dxa"/>
+            <w:shd w:val="clear" w:color="auto" w:fill="92D050"/>
+          </w:tcPr>
+          <w:p>
+            <w:pPr>
+              <w:rPr>
+                <w:rFonts w:ascii="Times New Roman" w:hAnsi="Times New Roman" w:cs="Times New Roman"/>
+                <w:sz w:val="24"/>
+              </w:rPr>
+            </w:pPr>
+            <w:r>
+              <w:rPr>
+                <w:rFonts w:ascii="Times New Roman" w:hAnsi="Times New Roman" w:cs="Times New Roman"/>
+                <w:sz w:val="24"/>
+              </w:rPr>
+              <w:t xml:space="preserve">1. Передать страницу без заголовка в </w:t>
+            </w:r>
+            <w:r>
+              <w:rPr>
+                <w:rFonts w:ascii="Times New Roman" w:hAnsi="Times New Roman" w:cs="Times New Roman"/>
+                <w:sz w:val="24"/>
+                <w:lang w:val="en-US"/>
+              </w:rPr>
+              <w:t>get</w:t>
+            </w:r>
+            <w:r>
+              <w:rPr>
+                <w:rFonts w:ascii="Times New Roman" w:hAnsi="Times New Roman" w:cs="Times New Roman"/>
+                <w:sz w:val="24"/>
+              </w:rPr>
+              <w:t>_</w:t>
+            </w:r>
+            <w:proofErr w:type="gramStart"/>
+            <w:r>
+              <w:rPr>
+                <w:rFonts w:ascii="Times New Roman" w:hAnsi="Times New Roman" w:cs="Times New Roman"/>
+                <w:sz w:val="24"/>
+                <w:lang w:val="en-US"/>
+              </w:rPr>
+              <w:t>comments</w:t>
+            </w:r>
+            <w:r>
+              <w:rPr>
+                <w:rFonts w:ascii="Times New Roman" w:hAnsi="Times New Roman" w:cs="Times New Roman"/>
+                <w:sz w:val="24"/>
+              </w:rPr>
+              <w:t>(</w:t>
+            </w:r>
+            <w:proofErr w:type="gramEnd"/>
+            <w:r>
+              <w:rPr>
+                <w:rFonts w:ascii="Times New Roman" w:hAnsi="Times New Roman" w:cs="Times New Roman"/>
+                <w:sz w:val="24"/>
+              </w:rPr>
+              <w:t>)</w:t>
+            </w:r>
+          </w:p>
+        </w:tc>
+        <w:tc>
+          <w:tcPr>
+            <w:tcW w:w="3115" w:type="dxa"/>
+            <w:shd w:val="clear" w:color="auto" w:fill="92D050"/>
+          </w:tcPr>
+          <w:p>
+            <w:pPr>
+              <w:rPr>
+                <w:rFonts w:ascii="Times New Roman" w:hAnsi="Times New Roman" w:cs="Times New Roman"/>
+                <w:sz w:val="24"/>
+              </w:rPr>
+            </w:pPr>
+            <w:r>
+              <w:rPr>
+                <w:rFonts w:ascii="Times New Roman" w:hAnsi="Times New Roman" w:cs="Times New Roman"/>
+                <w:sz w:val="24"/>
+              </w:rPr>
+              <w:t>Функция вызывает ошибку</w:t>
+            </w:r>
+          </w:p>
+        </w:tc>
+      </w:tr>
+    </w:tbl>
+    <w:p>
+      <w:pPr>
+        <w:rPr>
+          <w:rFonts w:ascii="Times New Roman" w:hAnsi="Times New Roman" w:cs="Times New Roman"/>
+          <w:sz w:val="24"/>
+        </w:rPr>
+      </w:pPr>
+    </w:p>
+    <w:p>
+      <w:pPr>
+        <w:rPr>
+          <w:rFonts w:ascii="Times New Roman" w:hAnsi="Times New Roman" w:cs="Times New Roman"/>
+          <w:sz w:val="24"/>
         </w:rPr>
       </w:pPr>
       <w:bookmarkStart w:id="0" w:name="_GoBack"/>

</xml_diff>

<commit_message>
add test output documentation
</commit_message>
<xml_diff>
--- a/tests/doc/test_cases.docx
+++ b/tests/doc/test_cases.docx
@@ -50,7 +50,6 @@
           <w:sz w:val="24"/>
         </w:rPr>
       </w:pPr>
-      <w:proofErr w:type="spellStart"/>
       <w:r>
         <w:rPr>
           <w:rFonts w:ascii="Times New Roman" w:hAnsi="Times New Roman" w:cs="Times New Roman"/>
@@ -59,7 +58,6 @@
         </w:rPr>
         <w:t>get_requester_page</w:t>
       </w:r>
-      <w:proofErr w:type="spellEnd"/>
     </w:p>
     <w:p>
       <w:pPr>
@@ -824,6 +822,8 @@
           <w:lang w:val="en-US"/>
         </w:rPr>
       </w:pPr>
+      <w:bookmarkStart w:id="0" w:name="_GoBack"/>
+      <w:bookmarkEnd w:id="0"/>
     </w:p>
     <w:p>
       <w:pPr>
@@ -841,7 +841,6 @@
         </w:rPr>
         <w:t xml:space="preserve">Тестирование </w:t>
       </w:r>
-      <w:proofErr w:type="spellStart"/>
       <w:r>
         <w:rPr>
           <w:rFonts w:ascii="Times New Roman" w:hAnsi="Times New Roman" w:cs="Times New Roman"/>
@@ -850,7 +849,6 @@
         </w:rPr>
         <w:t>get_comments</w:t>
       </w:r>
-      <w:proofErr w:type="spellEnd"/>
     </w:p>
     <w:tbl>
       <w:tblPr>
@@ -1075,25 +1073,7 @@
                 <w:sz w:val="24"/>
                 <w:lang w:val="en-US"/>
               </w:rPr>
-              <w:t xml:space="preserve"> </w:t>
-            </w:r>
-            <w:proofErr w:type="spellStart"/>
-            <w:r>
-              <w:rPr>
-                <w:rFonts w:ascii="Times New Roman" w:hAnsi="Times New Roman" w:cs="Times New Roman"/>
-                <w:sz w:val="24"/>
-                <w:lang w:val="en-US"/>
-              </w:rPr>
-              <w:t>Comment_texts</w:t>
-            </w:r>
-            <w:proofErr w:type="spellEnd"/>
-            <w:r>
-              <w:rPr>
-                <w:rFonts w:ascii="Times New Roman" w:hAnsi="Times New Roman" w:cs="Times New Roman"/>
-                <w:sz w:val="24"/>
-                <w:lang w:val="en-US"/>
-              </w:rPr>
-              <w:t xml:space="preserve"> </w:t>
+              <w:t xml:space="preserve"> Comment_texts </w:t>
             </w:r>
             <w:r>
               <w:rPr>
@@ -1243,13 +1223,243 @@
     </w:p>
     <w:p>
       <w:pPr>
-        <w:rPr>
-          <w:rFonts w:ascii="Times New Roman" w:hAnsi="Times New Roman" w:cs="Times New Roman"/>
-          <w:sz w:val="24"/>
-        </w:rPr>
-      </w:pPr>
-      <w:bookmarkStart w:id="0" w:name="_GoBack"/>
-      <w:bookmarkEnd w:id="0"/>
+        <w:jc w:val="center"/>
+        <w:rPr>
+          <w:rFonts w:ascii="Times New Roman" w:hAnsi="Times New Roman" w:cs="Times New Roman"/>
+          <w:sz w:val="24"/>
+          <w:lang w:val="en-US"/>
+        </w:rPr>
+      </w:pPr>
+      <w:r>
+        <w:rPr>
+          <w:rFonts w:ascii="Times New Roman" w:hAnsi="Times New Roman" w:cs="Times New Roman"/>
+          <w:sz w:val="24"/>
+        </w:rPr>
+        <w:t xml:space="preserve">Тестирование </w:t>
+      </w:r>
+      <w:r>
+        <w:rPr>
+          <w:rFonts w:ascii="Times New Roman" w:hAnsi="Times New Roman" w:cs="Times New Roman"/>
+          <w:sz w:val="24"/>
+          <w:lang w:val="en-US"/>
+        </w:rPr>
+        <w:t>dump_json</w:t>
+      </w:r>
+    </w:p>
+    <w:tbl>
+      <w:tblPr>
+        <w:tblStyle w:val="a4"/>
+        <w:tblW w:w="0" w:type="auto"/>
+        <w:tblLook w:val="04A0" w:firstRow="1" w:lastRow="0" w:firstColumn="1" w:lastColumn="0" w:noHBand="0" w:noVBand="1"/>
+      </w:tblPr>
+      <w:tblGrid>
+        <w:gridCol w:w="3115"/>
+        <w:gridCol w:w="3115"/>
+        <w:gridCol w:w="3115"/>
+      </w:tblGrid>
+      <w:tr>
+        <w:tc>
+          <w:tcPr>
+            <w:tcW w:w="3115" w:type="dxa"/>
+            <w:shd w:val="clear" w:color="auto" w:fill="92D050"/>
+          </w:tcPr>
+          <w:p>
+            <w:pPr>
+              <w:rPr>
+                <w:rFonts w:ascii="Times New Roman" w:hAnsi="Times New Roman" w:cs="Times New Roman"/>
+                <w:sz w:val="24"/>
+              </w:rPr>
+            </w:pPr>
+            <w:r>
+              <w:rPr>
+                <w:rFonts w:ascii="Times New Roman" w:hAnsi="Times New Roman" w:cs="Times New Roman"/>
+                <w:sz w:val="24"/>
+              </w:rPr>
+              <w:t>Успешная запись файла</w:t>
+            </w:r>
+          </w:p>
+        </w:tc>
+        <w:tc>
+          <w:tcPr>
+            <w:tcW w:w="3115" w:type="dxa"/>
+            <w:shd w:val="clear" w:color="auto" w:fill="92D050"/>
+          </w:tcPr>
+          <w:p>
+            <w:pPr>
+              <w:rPr>
+                <w:rFonts w:ascii="Times New Roman" w:hAnsi="Times New Roman" w:cs="Times New Roman"/>
+                <w:sz w:val="24"/>
+              </w:rPr>
+            </w:pPr>
+            <w:r>
+              <w:rPr>
+                <w:rFonts w:ascii="Times New Roman" w:hAnsi="Times New Roman" w:cs="Times New Roman"/>
+                <w:sz w:val="24"/>
+              </w:rPr>
+              <w:t xml:space="preserve">1. Передать словарь в </w:t>
+            </w:r>
+            <w:proofErr w:type="spellStart"/>
+            <w:r>
+              <w:rPr>
+                <w:rFonts w:ascii="Times New Roman" w:hAnsi="Times New Roman" w:cs="Times New Roman"/>
+                <w:sz w:val="24"/>
+              </w:rPr>
+              <w:t>dump_</w:t>
+            </w:r>
+            <w:proofErr w:type="gramStart"/>
+            <w:r>
+              <w:rPr>
+                <w:rFonts w:ascii="Times New Roman" w:hAnsi="Times New Roman" w:cs="Times New Roman"/>
+                <w:sz w:val="24"/>
+              </w:rPr>
+              <w:t>json</w:t>
+            </w:r>
+            <w:proofErr w:type="spellEnd"/>
+            <w:r>
+              <w:rPr>
+                <w:rFonts w:ascii="Times New Roman" w:hAnsi="Times New Roman" w:cs="Times New Roman"/>
+                <w:sz w:val="24"/>
+              </w:rPr>
+              <w:t>(</w:t>
+            </w:r>
+            <w:proofErr w:type="gramEnd"/>
+            <w:r>
+              <w:rPr>
+                <w:rFonts w:ascii="Times New Roman" w:hAnsi="Times New Roman" w:cs="Times New Roman"/>
+                <w:sz w:val="24"/>
+              </w:rPr>
+              <w:t>)</w:t>
+            </w:r>
+          </w:p>
+        </w:tc>
+        <w:tc>
+          <w:tcPr>
+            <w:tcW w:w="3115" w:type="dxa"/>
+            <w:shd w:val="clear" w:color="auto" w:fill="92D050"/>
+          </w:tcPr>
+          <w:p>
+            <w:pPr>
+              <w:rPr>
+                <w:rFonts w:ascii="Times New Roman" w:hAnsi="Times New Roman" w:cs="Times New Roman"/>
+                <w:sz w:val="24"/>
+              </w:rPr>
+            </w:pPr>
+            <w:r>
+              <w:rPr>
+                <w:rFonts w:ascii="Times New Roman" w:hAnsi="Times New Roman" w:cs="Times New Roman"/>
+                <w:sz w:val="24"/>
+              </w:rPr>
+              <w:t xml:space="preserve">Создается файл </w:t>
+            </w:r>
+            <w:proofErr w:type="spellStart"/>
+            <w:r>
+              <w:rPr>
+                <w:rFonts w:ascii="Times New Roman" w:hAnsi="Times New Roman" w:cs="Times New Roman"/>
+                <w:sz w:val="24"/>
+              </w:rPr>
+              <w:t>output.json</w:t>
+            </w:r>
+            <w:proofErr w:type="spellEnd"/>
+          </w:p>
+        </w:tc>
+      </w:tr>
+      <w:tr>
+        <w:tc>
+          <w:tcPr>
+            <w:tcW w:w="3115" w:type="dxa"/>
+            <w:shd w:val="clear" w:color="auto" w:fill="92D050"/>
+          </w:tcPr>
+          <w:p>
+            <w:pPr>
+              <w:rPr>
+                <w:rFonts w:ascii="Times New Roman" w:hAnsi="Times New Roman" w:cs="Times New Roman"/>
+                <w:sz w:val="24"/>
+              </w:rPr>
+            </w:pPr>
+            <w:r>
+              <w:rPr>
+                <w:rFonts w:ascii="Times New Roman" w:hAnsi="Times New Roman" w:cs="Times New Roman"/>
+                <w:sz w:val="24"/>
+              </w:rPr>
+              <w:t>Проверка корректности записи</w:t>
+            </w:r>
+          </w:p>
+        </w:tc>
+        <w:tc>
+          <w:tcPr>
+            <w:tcW w:w="3115" w:type="dxa"/>
+            <w:shd w:val="clear" w:color="auto" w:fill="92D050"/>
+          </w:tcPr>
+          <w:p>
+            <w:pPr>
+              <w:rPr>
+                <w:rFonts w:ascii="Times New Roman" w:hAnsi="Times New Roman" w:cs="Times New Roman"/>
+                <w:sz w:val="24"/>
+              </w:rPr>
+            </w:pPr>
+            <w:r>
+              <w:rPr>
+                <w:rFonts w:ascii="Times New Roman" w:hAnsi="Times New Roman" w:cs="Times New Roman"/>
+                <w:sz w:val="24"/>
+              </w:rPr>
+              <w:t xml:space="preserve">1. Открыть </w:t>
+            </w:r>
+            <w:proofErr w:type="spellStart"/>
+            <w:r>
+              <w:rPr>
+                <w:rFonts w:ascii="Times New Roman" w:hAnsi="Times New Roman" w:cs="Times New Roman"/>
+                <w:sz w:val="24"/>
+              </w:rPr>
+              <w:t>output.json</w:t>
+            </w:r>
+            <w:proofErr w:type="spellEnd"/>
+            <w:r>
+              <w:rPr>
+                <w:rFonts w:ascii="Times New Roman" w:hAnsi="Times New Roman" w:cs="Times New Roman"/>
+                <w:sz w:val="24"/>
+              </w:rPr>
+              <w:t xml:space="preserve"> после записи</w:t>
+            </w:r>
+          </w:p>
+        </w:tc>
+        <w:tc>
+          <w:tcPr>
+            <w:tcW w:w="3115" w:type="dxa"/>
+            <w:shd w:val="clear" w:color="auto" w:fill="92D050"/>
+          </w:tcPr>
+          <w:p>
+            <w:pPr>
+              <w:rPr>
+                <w:rFonts w:ascii="Times New Roman" w:hAnsi="Times New Roman" w:cs="Times New Roman"/>
+                <w:sz w:val="24"/>
+              </w:rPr>
+            </w:pPr>
+            <w:r>
+              <w:rPr>
+                <w:rFonts w:ascii="Times New Roman" w:hAnsi="Times New Roman" w:cs="Times New Roman"/>
+                <w:sz w:val="24"/>
+              </w:rPr>
+              <w:t>Данные совпадают с переданными</w:t>
+            </w:r>
+          </w:p>
+        </w:tc>
+      </w:tr>
+    </w:tbl>
+    <w:p>
+      <w:pPr>
+        <w:rPr>
+          <w:rFonts w:ascii="Times New Roman" w:hAnsi="Times New Roman" w:cs="Times New Roman"/>
+          <w:sz w:val="24"/>
+        </w:rPr>
+      </w:pPr>
+    </w:p>
+    <w:p>
+      <w:pPr>
+        <w:rPr>
+          <w:rFonts w:ascii="Times New Roman" w:hAnsi="Times New Roman" w:cs="Times New Roman"/>
+          <w:sz w:val="24"/>
+        </w:rPr>
+      </w:pPr>
     </w:p>
     <w:sectPr>
       <w:pgSz w:w="11906" w:h="16838"/>

</xml_diff>

<commit_message>
add test entropy filter documentation
</commit_message>
<xml_diff>
--- a/tests/doc/test_cases.docx
+++ b/tests/doc/test_cases.docx
@@ -71,7 +71,6 @@
           <w:sz w:val="24"/>
         </w:rPr>
       </w:pPr>
-      <w:proofErr w:type="spellStart"/>
       <w:r>
         <w:rPr>
           <w:rFonts w:ascii="Times New Roman" w:hAnsi="Times New Roman" w:cs="Times New Roman"/>
@@ -80,7 +79,6 @@
         </w:rPr>
         <w:t>get_comments</w:t>
       </w:r>
-      <w:proofErr w:type="spellEnd"/>
     </w:p>
     <w:p>
       <w:pPr>
@@ -104,6 +102,73 @@
         <w:t>dump_json</w:t>
       </w:r>
       <w:proofErr w:type="spellEnd"/>
+    </w:p>
+    <w:p>
+      <w:pPr>
+        <w:pStyle w:val="a3"/>
+        <w:numPr>
+          <w:ilvl w:val="0"/>
+          <w:numId w:val="1"/>
+        </w:numPr>
+        <w:rPr>
+          <w:rFonts w:ascii="Times New Roman" w:hAnsi="Times New Roman" w:cs="Times New Roman"/>
+          <w:sz w:val="24"/>
+        </w:rPr>
+      </w:pPr>
+      <w:proofErr w:type="spellStart"/>
+      <w:r>
+        <w:rPr>
+          <w:rFonts w:ascii="Times New Roman" w:hAnsi="Times New Roman" w:cs="Times New Roman"/>
+          <w:sz w:val="24"/>
+          <w:lang w:val="en-US"/>
+        </w:rPr>
+        <w:t>is_ai_russian</w:t>
+      </w:r>
+      <w:proofErr w:type="spellEnd"/>
+    </w:p>
+    <w:p>
+      <w:pPr>
+        <w:pStyle w:val="a3"/>
+        <w:numPr>
+          <w:ilvl w:val="0"/>
+          <w:numId w:val="1"/>
+        </w:numPr>
+        <w:rPr>
+          <w:rFonts w:ascii="Times New Roman" w:hAnsi="Times New Roman" w:cs="Times New Roman"/>
+          <w:sz w:val="24"/>
+        </w:rPr>
+      </w:pPr>
+      <w:proofErr w:type="spellStart"/>
+      <w:r>
+        <w:rPr>
+          <w:rFonts w:ascii="Times New Roman" w:hAnsi="Times New Roman" w:cs="Times New Roman"/>
+          <w:sz w:val="24"/>
+          <w:lang w:val="en-US"/>
+        </w:rPr>
+        <w:t>russian_entropy</w:t>
+      </w:r>
+      <w:proofErr w:type="spellEnd"/>
+    </w:p>
+    <w:p>
+      <w:pPr>
+        <w:pStyle w:val="a3"/>
+        <w:numPr>
+          <w:ilvl w:val="0"/>
+          <w:numId w:val="1"/>
+        </w:numPr>
+        <w:rPr>
+          <w:rFonts w:ascii="Times New Roman" w:hAnsi="Times New Roman" w:cs="Times New Roman"/>
+          <w:sz w:val="24"/>
+        </w:rPr>
+      </w:pPr>
+      <w:r>
+        <w:rPr>
+          <w:rFonts w:ascii="Times New Roman" w:hAnsi="Times New Roman" w:cs="Times New Roman"/>
+          <w:sz w:val="24"/>
+          <w:lang w:val="en-US"/>
+        </w:rPr>
+        <w:t>list_low_entropy</w:t>
+      </w:r>
     </w:p>
     <w:p>
       <w:pPr>
@@ -822,8 +887,6 @@
           <w:lang w:val="en-US"/>
         </w:rPr>
       </w:pPr>
-      <w:bookmarkStart w:id="0" w:name="_GoBack"/>
-      <w:bookmarkEnd w:id="0"/>
     </w:p>
     <w:p>
       <w:pPr>
@@ -1447,6 +1510,255 @@
     </w:tbl>
     <w:p>
       <w:pPr>
+        <w:jc w:val="center"/>
+        <w:rPr>
+          <w:rFonts w:ascii="Times New Roman" w:hAnsi="Times New Roman" w:cs="Times New Roman"/>
+          <w:sz w:val="24"/>
+          <w:lang w:val="en-US"/>
+        </w:rPr>
+      </w:pPr>
+      <w:r>
+        <w:rPr>
+          <w:rFonts w:ascii="Times New Roman" w:hAnsi="Times New Roman" w:cs="Times New Roman"/>
+          <w:sz w:val="24"/>
+        </w:rPr>
+        <w:lastRenderedPageBreak/>
+        <w:t xml:space="preserve">Тестирование </w:t>
+      </w:r>
+      <w:r>
+        <w:rPr>
+          <w:rFonts w:ascii="Times New Roman" w:hAnsi="Times New Roman" w:cs="Times New Roman"/>
+          <w:sz w:val="24"/>
+          <w:lang w:val="en-US"/>
+        </w:rPr>
+        <w:t>list_low_entropy</w:t>
+      </w:r>
+    </w:p>
+    <w:tbl>
+      <w:tblPr>
+        <w:tblStyle w:val="a4"/>
+        <w:tblW w:w="0" w:type="auto"/>
+        <w:tblLook w:val="04A0" w:firstRow="1" w:lastRow="0" w:firstColumn="1" w:lastColumn="0" w:noHBand="0" w:noVBand="1"/>
+      </w:tblPr>
+      <w:tblGrid>
+        <w:gridCol w:w="3115"/>
+        <w:gridCol w:w="3115"/>
+        <w:gridCol w:w="3115"/>
+      </w:tblGrid>
+      <w:tr>
+        <w:tc>
+          <w:tcPr>
+            <w:tcW w:w="3115" w:type="dxa"/>
+            <w:shd w:val="clear" w:color="auto" w:fill="92D050"/>
+          </w:tcPr>
+          <w:p>
+            <w:pPr>
+              <w:rPr>
+                <w:rFonts w:ascii="Times New Roman" w:hAnsi="Times New Roman" w:cs="Times New Roman"/>
+                <w:sz w:val="24"/>
+              </w:rPr>
+            </w:pPr>
+            <w:r>
+              <w:rPr>
+                <w:rFonts w:ascii="Times New Roman" w:hAnsi="Times New Roman" w:cs="Times New Roman"/>
+                <w:sz w:val="24"/>
+              </w:rPr>
+              <w:t>Комментарий с низкой энтропией</w:t>
+            </w:r>
+          </w:p>
+        </w:tc>
+        <w:tc>
+          <w:tcPr>
+            <w:tcW w:w="3115" w:type="dxa"/>
+            <w:shd w:val="clear" w:color="auto" w:fill="92D050"/>
+          </w:tcPr>
+          <w:p>
+            <w:pPr>
+              <w:rPr>
+                <w:rFonts w:ascii="Times New Roman" w:hAnsi="Times New Roman" w:cs="Times New Roman"/>
+                <w:sz w:val="24"/>
+              </w:rPr>
+            </w:pPr>
+            <w:r>
+              <w:rPr>
+                <w:rFonts w:ascii="Times New Roman" w:hAnsi="Times New Roman" w:cs="Times New Roman"/>
+                <w:sz w:val="24"/>
+              </w:rPr>
+              <w:t>1. Передать словарь с комментарием с низкой энтропией</w:t>
+            </w:r>
+          </w:p>
+          <w:p>
+            <w:pPr>
+              <w:rPr>
+                <w:rFonts w:ascii="Times New Roman" w:hAnsi="Times New Roman" w:cs="Times New Roman"/>
+                <w:sz w:val="24"/>
+              </w:rPr>
+            </w:pPr>
+            <w:r>
+              <w:rPr>
+                <w:rFonts w:ascii="Times New Roman" w:hAnsi="Times New Roman" w:cs="Times New Roman"/>
+                <w:sz w:val="24"/>
+              </w:rPr>
+              <w:t xml:space="preserve">2. Установить </w:t>
+            </w:r>
+            <w:r>
+              <w:rPr>
+                <w:rFonts w:ascii="Times New Roman" w:hAnsi="Times New Roman" w:cs="Times New Roman"/>
+                <w:sz w:val="24"/>
+                <w:lang w:val="en-US"/>
+              </w:rPr>
+              <w:t xml:space="preserve">threshold </w:t>
+            </w:r>
+            <w:r>
+              <w:rPr>
+                <w:rFonts w:ascii="Times New Roman" w:hAnsi="Times New Roman" w:cs="Times New Roman"/>
+                <w:sz w:val="24"/>
+              </w:rPr>
+              <w:t>больше энтропии</w:t>
+            </w:r>
+          </w:p>
+        </w:tc>
+        <w:tc>
+          <w:tcPr>
+            <w:tcW w:w="3115" w:type="dxa"/>
+            <w:shd w:val="clear" w:color="auto" w:fill="92D050"/>
+          </w:tcPr>
+          <w:p>
+            <w:pPr>
+              <w:rPr>
+                <w:rFonts w:ascii="Times New Roman" w:hAnsi="Times New Roman" w:cs="Times New Roman"/>
+                <w:sz w:val="24"/>
+              </w:rPr>
+            </w:pPr>
+            <w:r>
+              <w:rPr>
+                <w:rFonts w:ascii="Times New Roman" w:hAnsi="Times New Roman" w:cs="Times New Roman"/>
+                <w:sz w:val="24"/>
+              </w:rPr>
+              <w:t>В консоль выводится предупреждение</w:t>
+            </w:r>
+          </w:p>
+        </w:tc>
+      </w:tr>
+      <w:tr>
+        <w:tc>
+          <w:tcPr>
+            <w:tcW w:w="3115" w:type="dxa"/>
+            <w:shd w:val="clear" w:color="auto" w:fill="92D050"/>
+          </w:tcPr>
+          <w:p>
+            <w:pPr>
+              <w:rPr>
+                <w:rFonts w:ascii="Times New Roman" w:hAnsi="Times New Roman" w:cs="Times New Roman"/>
+                <w:sz w:val="24"/>
+              </w:rPr>
+            </w:pPr>
+            <w:r>
+              <w:rPr>
+                <w:rFonts w:ascii="Times New Roman" w:hAnsi="Times New Roman" w:cs="Times New Roman"/>
+                <w:sz w:val="24"/>
+              </w:rPr>
+              <w:t>Комментарий с нормальной энтропией</w:t>
+            </w:r>
+          </w:p>
+        </w:tc>
+        <w:tc>
+          <w:tcPr>
+            <w:tcW w:w="3115" w:type="dxa"/>
+            <w:shd w:val="clear" w:color="auto" w:fill="92D050"/>
+          </w:tcPr>
+          <w:p>
+            <w:pPr>
+              <w:rPr>
+                <w:rFonts w:ascii="Times New Roman" w:hAnsi="Times New Roman" w:cs="Times New Roman"/>
+                <w:sz w:val="24"/>
+              </w:rPr>
+            </w:pPr>
+            <w:r>
+              <w:rPr>
+                <w:rFonts w:ascii="Times New Roman" w:hAnsi="Times New Roman" w:cs="Times New Roman"/>
+                <w:sz w:val="24"/>
+              </w:rPr>
+              <w:t xml:space="preserve">1. Передать словарь с комментарием с </w:t>
+            </w:r>
+            <w:r>
+              <w:rPr>
+                <w:rFonts w:ascii="Times New Roman" w:hAnsi="Times New Roman" w:cs="Times New Roman"/>
+                <w:sz w:val="24"/>
+              </w:rPr>
+              <w:t>нормальной</w:t>
+            </w:r>
+            <w:r>
+              <w:rPr>
+                <w:rFonts w:ascii="Times New Roman" w:hAnsi="Times New Roman" w:cs="Times New Roman"/>
+                <w:sz w:val="24"/>
+              </w:rPr>
+              <w:t xml:space="preserve"> энтропией</w:t>
+            </w:r>
+          </w:p>
+          <w:p>
+            <w:pPr>
+              <w:rPr>
+                <w:rFonts w:ascii="Times New Roman" w:hAnsi="Times New Roman" w:cs="Times New Roman"/>
+                <w:sz w:val="24"/>
+              </w:rPr>
+            </w:pPr>
+            <w:r>
+              <w:rPr>
+                <w:rFonts w:ascii="Times New Roman" w:hAnsi="Times New Roman" w:cs="Times New Roman"/>
+                <w:sz w:val="24"/>
+              </w:rPr>
+              <w:t xml:space="preserve">2. Установить </w:t>
+            </w:r>
+            <w:r>
+              <w:rPr>
+                <w:rFonts w:ascii="Times New Roman" w:hAnsi="Times New Roman" w:cs="Times New Roman"/>
+                <w:sz w:val="24"/>
+                <w:lang w:val="en-US"/>
+              </w:rPr>
+              <w:t xml:space="preserve">threshold </w:t>
+            </w:r>
+            <w:r>
+              <w:rPr>
+                <w:rFonts w:ascii="Times New Roman" w:hAnsi="Times New Roman" w:cs="Times New Roman"/>
+                <w:sz w:val="24"/>
+              </w:rPr>
+              <w:t>меньше</w:t>
+            </w:r>
+            <w:r>
+              <w:rPr>
+                <w:rFonts w:ascii="Times New Roman" w:hAnsi="Times New Roman" w:cs="Times New Roman"/>
+                <w:sz w:val="24"/>
+              </w:rPr>
+              <w:t xml:space="preserve"> энтропии</w:t>
+            </w:r>
+          </w:p>
+        </w:tc>
+        <w:tc>
+          <w:tcPr>
+            <w:tcW w:w="3115" w:type="dxa"/>
+            <w:shd w:val="clear" w:color="auto" w:fill="92D050"/>
+          </w:tcPr>
+          <w:p>
+            <w:pPr>
+              <w:rPr>
+                <w:rFonts w:ascii="Times New Roman" w:hAnsi="Times New Roman" w:cs="Times New Roman"/>
+                <w:sz w:val="24"/>
+              </w:rPr>
+            </w:pPr>
+            <w:r>
+              <w:rPr>
+                <w:rFonts w:ascii="Times New Roman" w:hAnsi="Times New Roman" w:cs="Times New Roman"/>
+                <w:sz w:val="24"/>
+              </w:rPr>
+              <w:t>В консоль ничего не выводится</w:t>
+            </w:r>
+          </w:p>
+        </w:tc>
+      </w:tr>
+    </w:tbl>
+    <w:p>
+      <w:pPr>
         <w:rPr>
           <w:rFonts w:ascii="Times New Roman" w:hAnsi="Times New Roman" w:cs="Times New Roman"/>
           <w:sz w:val="24"/>
@@ -1460,6 +1772,17 @@
           <w:sz w:val="24"/>
         </w:rPr>
       </w:pPr>
+    </w:p>
+    <w:p>
+      <w:pPr>
+        <w:rPr>
+          <w:rFonts w:ascii="Times New Roman" w:hAnsi="Times New Roman" w:cs="Times New Roman"/>
+          <w:sz w:val="24"/>
+          <w:lang w:val="en-US"/>
+        </w:rPr>
+      </w:pPr>
+      <w:bookmarkStart w:id="0" w:name="_GoBack"/>
+      <w:bookmarkEnd w:id="0"/>
     </w:p>
     <w:sectPr>
       <w:pgSz w:w="11906" w:h="16838"/>

</xml_diff>

<commit_message>
add test entropy documentation
</commit_message>
<xml_diff>
--- a/tests/doc/test_cases.docx
+++ b/tests/doc/test_cases.docx
@@ -100,29 +100,6 @@
           <w:lang w:val="en-US"/>
         </w:rPr>
         <w:t>dump_json</w:t>
-      </w:r>
-      <w:proofErr w:type="spellEnd"/>
-    </w:p>
-    <w:p>
-      <w:pPr>
-        <w:pStyle w:val="a3"/>
-        <w:numPr>
-          <w:ilvl w:val="0"/>
-          <w:numId w:val="1"/>
-        </w:numPr>
-        <w:rPr>
-          <w:rFonts w:ascii="Times New Roman" w:hAnsi="Times New Roman" w:cs="Times New Roman"/>
-          <w:sz w:val="24"/>
-        </w:rPr>
-      </w:pPr>
-      <w:proofErr w:type="spellStart"/>
-      <w:r>
-        <w:rPr>
-          <w:rFonts w:ascii="Times New Roman" w:hAnsi="Times New Roman" w:cs="Times New Roman"/>
-          <w:sz w:val="24"/>
-          <w:lang w:val="en-US"/>
-        </w:rPr>
-        <w:t>is_ai_russian</w:t>
       </w:r>
       <w:proofErr w:type="spellEnd"/>
     </w:p>
@@ -1522,7 +1499,6 @@
           <w:rFonts w:ascii="Times New Roman" w:hAnsi="Times New Roman" w:cs="Times New Roman"/>
           <w:sz w:val="24"/>
         </w:rPr>
-        <w:lastRenderedPageBreak/>
         <w:t xml:space="preserve">Тестирование </w:t>
       </w:r>
       <w:r>
@@ -1563,6 +1539,7 @@
                 <w:rFonts w:ascii="Times New Roman" w:hAnsi="Times New Roman" w:cs="Times New Roman"/>
                 <w:sz w:val="24"/>
               </w:rPr>
+              <w:lastRenderedPageBreak/>
               <w:t>Комментарий с низкой энтропией</w:t>
             </w:r>
           </w:p>
@@ -1679,21 +1656,7 @@
                 <w:rFonts w:ascii="Times New Roman" w:hAnsi="Times New Roman" w:cs="Times New Roman"/>
                 <w:sz w:val="24"/>
               </w:rPr>
-              <w:t xml:space="preserve">1. Передать словарь с комментарием с </w:t>
-            </w:r>
-            <w:r>
-              <w:rPr>
-                <w:rFonts w:ascii="Times New Roman" w:hAnsi="Times New Roman" w:cs="Times New Roman"/>
-                <w:sz w:val="24"/>
-              </w:rPr>
-              <w:t>нормальной</w:t>
-            </w:r>
-            <w:r>
-              <w:rPr>
-                <w:rFonts w:ascii="Times New Roman" w:hAnsi="Times New Roman" w:cs="Times New Roman"/>
-                <w:sz w:val="24"/>
-              </w:rPr>
-              <w:t xml:space="preserve"> энтропией</w:t>
+              <w:t>1. Передать словарь с комментарием с нормальной энтропией</w:t>
             </w:r>
           </w:p>
           <w:p>
@@ -1723,14 +1686,7 @@
                 <w:rFonts w:ascii="Times New Roman" w:hAnsi="Times New Roman" w:cs="Times New Roman"/>
                 <w:sz w:val="24"/>
               </w:rPr>
-              <w:t>меньше</w:t>
-            </w:r>
-            <w:r>
-              <w:rPr>
-                <w:rFonts w:ascii="Times New Roman" w:hAnsi="Times New Roman" w:cs="Times New Roman"/>
-                <w:sz w:val="24"/>
-              </w:rPr>
-              <w:t xml:space="preserve"> энтропии</w:t>
+              <w:t>меньше энтропии</w:t>
             </w:r>
           </w:p>
         </w:tc>
@@ -1767,6 +1723,432 @@
     </w:p>
     <w:p>
       <w:pPr>
+        <w:jc w:val="center"/>
+        <w:rPr>
+          <w:rFonts w:ascii="Times New Roman" w:hAnsi="Times New Roman" w:cs="Times New Roman"/>
+          <w:sz w:val="24"/>
+          <w:lang w:val="en-US"/>
+        </w:rPr>
+      </w:pPr>
+      <w:r>
+        <w:rPr>
+          <w:rFonts w:ascii="Times New Roman" w:hAnsi="Times New Roman" w:cs="Times New Roman"/>
+          <w:sz w:val="24"/>
+        </w:rPr>
+        <w:t xml:space="preserve">Тестирование </w:t>
+      </w:r>
+      <w:proofErr w:type="spellStart"/>
+      <w:r>
+        <w:rPr>
+          <w:rFonts w:ascii="Times New Roman" w:hAnsi="Times New Roman" w:cs="Times New Roman"/>
+          <w:sz w:val="24"/>
+          <w:lang w:val="en-US"/>
+        </w:rPr>
+        <w:t>russian</w:t>
+      </w:r>
+      <w:proofErr w:type="spellEnd"/>
+      <w:r>
+        <w:rPr>
+          <w:rFonts w:ascii="Times New Roman" w:hAnsi="Times New Roman" w:cs="Times New Roman"/>
+          <w:sz w:val="24"/>
+        </w:rPr>
+        <w:t>_</w:t>
+      </w:r>
+      <w:r>
+        <w:rPr>
+          <w:rFonts w:ascii="Times New Roman" w:hAnsi="Times New Roman" w:cs="Times New Roman"/>
+          <w:sz w:val="24"/>
+          <w:lang w:val="en-US"/>
+        </w:rPr>
+        <w:t>entropy</w:t>
+      </w:r>
+    </w:p>
+    <w:tbl>
+      <w:tblPr>
+        <w:tblStyle w:val="a4"/>
+        <w:tblW w:w="0" w:type="auto"/>
+        <w:tblLook w:val="04A0" w:firstRow="1" w:lastRow="0" w:firstColumn="1" w:lastColumn="0" w:noHBand="0" w:noVBand="1"/>
+      </w:tblPr>
+      <w:tblGrid>
+        <w:gridCol w:w="3115"/>
+        <w:gridCol w:w="3115"/>
+        <w:gridCol w:w="3115"/>
+      </w:tblGrid>
+      <w:tr>
+        <w:tc>
+          <w:tcPr>
+            <w:tcW w:w="3115" w:type="dxa"/>
+            <w:shd w:val="clear" w:color="auto" w:fill="92D050"/>
+          </w:tcPr>
+          <w:p>
+            <w:pPr>
+              <w:rPr>
+                <w:rFonts w:ascii="Times New Roman" w:hAnsi="Times New Roman" w:cs="Times New Roman"/>
+                <w:sz w:val="24"/>
+              </w:rPr>
+            </w:pPr>
+            <w:r>
+              <w:rPr>
+                <w:rFonts w:ascii="Times New Roman" w:hAnsi="Times New Roman" w:cs="Times New Roman"/>
+                <w:sz w:val="24"/>
+              </w:rPr>
+              <w:t>Пустой</w:t>
+            </w:r>
+            <w:r>
+              <w:rPr>
+                <w:rFonts w:ascii="Times New Roman" w:hAnsi="Times New Roman" w:cs="Times New Roman"/>
+                <w:sz w:val="24"/>
+              </w:rPr>
+              <w:t xml:space="preserve"> текст</w:t>
+            </w:r>
+          </w:p>
+        </w:tc>
+        <w:tc>
+          <w:tcPr>
+            <w:tcW w:w="3115" w:type="dxa"/>
+            <w:shd w:val="clear" w:color="auto" w:fill="92D050"/>
+          </w:tcPr>
+          <w:p>
+            <w:pPr>
+              <w:rPr>
+                <w:rFonts w:ascii="Times New Roman" w:hAnsi="Times New Roman" w:cs="Times New Roman"/>
+                <w:sz w:val="24"/>
+              </w:rPr>
+            </w:pPr>
+            <w:r>
+              <w:rPr>
+                <w:rFonts w:ascii="Times New Roman" w:hAnsi="Times New Roman" w:cs="Times New Roman"/>
+                <w:sz w:val="24"/>
+              </w:rPr>
+              <w:t xml:space="preserve">1. Вызывать </w:t>
+            </w:r>
+            <w:proofErr w:type="spellStart"/>
+            <w:r>
+              <w:rPr>
+                <w:rFonts w:ascii="Times New Roman" w:hAnsi="Times New Roman" w:cs="Times New Roman"/>
+                <w:sz w:val="24"/>
+                <w:lang w:val="en-US"/>
+              </w:rPr>
+              <w:t>russian</w:t>
+            </w:r>
+            <w:proofErr w:type="spellEnd"/>
+            <w:r>
+              <w:rPr>
+                <w:rFonts w:ascii="Times New Roman" w:hAnsi="Times New Roman" w:cs="Times New Roman"/>
+                <w:sz w:val="24"/>
+              </w:rPr>
+              <w:t>_</w:t>
+            </w:r>
+            <w:r>
+              <w:rPr>
+                <w:rFonts w:ascii="Times New Roman" w:hAnsi="Times New Roman" w:cs="Times New Roman"/>
+                <w:sz w:val="24"/>
+                <w:lang w:val="en-US"/>
+              </w:rPr>
+              <w:t>entropy</w:t>
+            </w:r>
+            <w:r>
+              <w:rPr>
+                <w:rFonts w:ascii="Times New Roman" w:hAnsi="Times New Roman" w:cs="Times New Roman"/>
+                <w:sz w:val="24"/>
+              </w:rPr>
+              <w:t xml:space="preserve"> </w:t>
+            </w:r>
+            <w:r>
+              <w:rPr>
+                <w:rFonts w:ascii="Times New Roman" w:hAnsi="Times New Roman" w:cs="Times New Roman"/>
+                <w:sz w:val="24"/>
+              </w:rPr>
+              <w:t>с</w:t>
+            </w:r>
+            <w:r>
+              <w:rPr>
+                <w:rFonts w:ascii="Times New Roman" w:hAnsi="Times New Roman" w:cs="Times New Roman"/>
+                <w:sz w:val="24"/>
+              </w:rPr>
+              <w:t xml:space="preserve"> </w:t>
+            </w:r>
+            <w:r>
+              <w:rPr>
+                <w:rFonts w:ascii="Times New Roman" w:hAnsi="Times New Roman" w:cs="Times New Roman"/>
+                <w:sz w:val="24"/>
+              </w:rPr>
+              <w:t>пустой строкой</w:t>
+            </w:r>
+          </w:p>
+        </w:tc>
+        <w:tc>
+          <w:tcPr>
+            <w:tcW w:w="3115" w:type="dxa"/>
+            <w:shd w:val="clear" w:color="auto" w:fill="92D050"/>
+          </w:tcPr>
+          <w:p>
+            <w:pPr>
+              <w:rPr>
+                <w:rFonts w:ascii="Times New Roman" w:hAnsi="Times New Roman" w:cs="Times New Roman"/>
+                <w:sz w:val="24"/>
+              </w:rPr>
+            </w:pPr>
+            <w:r>
+              <w:rPr>
+                <w:rFonts w:ascii="Times New Roman" w:hAnsi="Times New Roman" w:cs="Times New Roman"/>
+                <w:sz w:val="24"/>
+              </w:rPr>
+              <w:t xml:space="preserve">Возвращается </w:t>
+            </w:r>
+            <w:r>
+              <w:rPr>
+                <w:rFonts w:ascii="Times New Roman" w:hAnsi="Times New Roman" w:cs="Times New Roman"/>
+                <w:sz w:val="24"/>
+              </w:rPr>
+              <w:t>0</w:t>
+            </w:r>
+          </w:p>
+        </w:tc>
+      </w:tr>
+      <w:tr>
+        <w:tc>
+          <w:tcPr>
+            <w:tcW w:w="3115" w:type="dxa"/>
+            <w:shd w:val="clear" w:color="auto" w:fill="92D050"/>
+          </w:tcPr>
+          <w:p>
+            <w:pPr>
+              <w:rPr>
+                <w:rFonts w:ascii="Times New Roman" w:hAnsi="Times New Roman" w:cs="Times New Roman"/>
+                <w:sz w:val="24"/>
+              </w:rPr>
+            </w:pPr>
+            <w:r>
+              <w:rPr>
+                <w:rFonts w:ascii="Times New Roman" w:hAnsi="Times New Roman" w:cs="Times New Roman"/>
+                <w:sz w:val="24"/>
+              </w:rPr>
+              <w:t xml:space="preserve">Один </w:t>
+            </w:r>
+            <w:proofErr w:type="spellStart"/>
+            <w:r>
+              <w:rPr>
+                <w:rFonts w:ascii="Times New Roman" w:hAnsi="Times New Roman" w:cs="Times New Roman"/>
+                <w:sz w:val="24"/>
+              </w:rPr>
+              <w:t>токен</w:t>
+            </w:r>
+            <w:proofErr w:type="spellEnd"/>
+          </w:p>
+        </w:tc>
+        <w:tc>
+          <w:tcPr>
+            <w:tcW w:w="3115" w:type="dxa"/>
+            <w:shd w:val="clear" w:color="auto" w:fill="92D050"/>
+          </w:tcPr>
+          <w:p>
+            <w:pPr>
+              <w:rPr>
+                <w:rFonts w:ascii="Times New Roman" w:hAnsi="Times New Roman" w:cs="Times New Roman"/>
+                <w:sz w:val="24"/>
+              </w:rPr>
+            </w:pPr>
+            <w:r>
+              <w:rPr>
+                <w:rFonts w:ascii="Times New Roman" w:hAnsi="Times New Roman" w:cs="Times New Roman"/>
+                <w:sz w:val="24"/>
+              </w:rPr>
+              <w:t xml:space="preserve">1. Вызывать </w:t>
+            </w:r>
+            <w:proofErr w:type="spellStart"/>
+            <w:r>
+              <w:rPr>
+                <w:rFonts w:ascii="Times New Roman" w:hAnsi="Times New Roman" w:cs="Times New Roman"/>
+                <w:sz w:val="24"/>
+                <w:lang w:val="en-US"/>
+              </w:rPr>
+              <w:t>russian</w:t>
+            </w:r>
+            <w:proofErr w:type="spellEnd"/>
+            <w:r>
+              <w:rPr>
+                <w:rFonts w:ascii="Times New Roman" w:hAnsi="Times New Roman" w:cs="Times New Roman"/>
+                <w:sz w:val="24"/>
+              </w:rPr>
+              <w:t>_</w:t>
+            </w:r>
+            <w:r>
+              <w:rPr>
+                <w:rFonts w:ascii="Times New Roman" w:hAnsi="Times New Roman" w:cs="Times New Roman"/>
+                <w:sz w:val="24"/>
+                <w:lang w:val="en-US"/>
+              </w:rPr>
+              <w:t>entropy</w:t>
+            </w:r>
+            <w:r>
+              <w:rPr>
+                <w:rFonts w:ascii="Times New Roman" w:hAnsi="Times New Roman" w:cs="Times New Roman"/>
+                <w:sz w:val="24"/>
+              </w:rPr>
+              <w:t xml:space="preserve"> </w:t>
+            </w:r>
+            <w:r>
+              <w:rPr>
+                <w:rFonts w:ascii="Times New Roman" w:hAnsi="Times New Roman" w:cs="Times New Roman"/>
+                <w:sz w:val="24"/>
+              </w:rPr>
+              <w:t>с</w:t>
+            </w:r>
+            <w:r>
+              <w:rPr>
+                <w:rFonts w:ascii="Times New Roman" w:hAnsi="Times New Roman" w:cs="Times New Roman"/>
+                <w:sz w:val="24"/>
+              </w:rPr>
+              <w:t xml:space="preserve"> одним словом</w:t>
+            </w:r>
+          </w:p>
+        </w:tc>
+        <w:tc>
+          <w:tcPr>
+            <w:tcW w:w="3115" w:type="dxa"/>
+            <w:shd w:val="clear" w:color="auto" w:fill="92D050"/>
+          </w:tcPr>
+          <w:p>
+            <w:pPr>
+              <w:rPr>
+                <w:rFonts w:ascii="Times New Roman" w:hAnsi="Times New Roman" w:cs="Times New Roman"/>
+                <w:sz w:val="24"/>
+              </w:rPr>
+            </w:pPr>
+            <w:r>
+              <w:rPr>
+                <w:rFonts w:ascii="Times New Roman" w:hAnsi="Times New Roman" w:cs="Times New Roman"/>
+                <w:sz w:val="24"/>
+              </w:rPr>
+              <w:t>Возвращается 0</w:t>
+            </w:r>
+          </w:p>
+        </w:tc>
+      </w:tr>
+      <w:tr>
+        <w:tc>
+          <w:tcPr>
+            <w:tcW w:w="3115" w:type="dxa"/>
+            <w:shd w:val="clear" w:color="auto" w:fill="92D050"/>
+          </w:tcPr>
+          <w:p>
+            <w:pPr>
+              <w:rPr>
+                <w:rFonts w:ascii="Times New Roman" w:hAnsi="Times New Roman" w:cs="Times New Roman"/>
+                <w:sz w:val="24"/>
+              </w:rPr>
+            </w:pPr>
+            <w:r>
+              <w:rPr>
+                <w:rFonts w:ascii="Times New Roman" w:hAnsi="Times New Roman" w:cs="Times New Roman"/>
+                <w:sz w:val="24"/>
+              </w:rPr>
+              <w:t xml:space="preserve">Несколько </w:t>
+            </w:r>
+            <w:proofErr w:type="spellStart"/>
+            <w:r>
+              <w:rPr>
+                <w:rFonts w:ascii="Times New Roman" w:hAnsi="Times New Roman" w:cs="Times New Roman"/>
+                <w:sz w:val="24"/>
+              </w:rPr>
+              <w:t>токенов</w:t>
+            </w:r>
+            <w:proofErr w:type="spellEnd"/>
+          </w:p>
+        </w:tc>
+        <w:tc>
+          <w:tcPr>
+            <w:tcW w:w="3115" w:type="dxa"/>
+            <w:shd w:val="clear" w:color="auto" w:fill="92D050"/>
+          </w:tcPr>
+          <w:p>
+            <w:pPr>
+              <w:rPr>
+                <w:rFonts w:ascii="Times New Roman" w:hAnsi="Times New Roman" w:cs="Times New Roman"/>
+                <w:sz w:val="24"/>
+              </w:rPr>
+            </w:pPr>
+            <w:r>
+              <w:rPr>
+                <w:rFonts w:ascii="Times New Roman" w:hAnsi="Times New Roman" w:cs="Times New Roman"/>
+                <w:sz w:val="24"/>
+              </w:rPr>
+              <w:t xml:space="preserve">1. Вызывать </w:t>
+            </w:r>
+            <w:proofErr w:type="spellStart"/>
+            <w:r>
+              <w:rPr>
+                <w:rFonts w:ascii="Times New Roman" w:hAnsi="Times New Roman" w:cs="Times New Roman"/>
+                <w:sz w:val="24"/>
+                <w:lang w:val="en-US"/>
+              </w:rPr>
+              <w:t>russian</w:t>
+            </w:r>
+            <w:proofErr w:type="spellEnd"/>
+            <w:r>
+              <w:rPr>
+                <w:rFonts w:ascii="Times New Roman" w:hAnsi="Times New Roman" w:cs="Times New Roman"/>
+                <w:sz w:val="24"/>
+              </w:rPr>
+              <w:t>_</w:t>
+            </w:r>
+            <w:r>
+              <w:rPr>
+                <w:rFonts w:ascii="Times New Roman" w:hAnsi="Times New Roman" w:cs="Times New Roman"/>
+                <w:sz w:val="24"/>
+                <w:lang w:val="en-US"/>
+              </w:rPr>
+              <w:t>entropy</w:t>
+            </w:r>
+            <w:r>
+              <w:rPr>
+                <w:rFonts w:ascii="Times New Roman" w:hAnsi="Times New Roman" w:cs="Times New Roman"/>
+                <w:sz w:val="24"/>
+              </w:rPr>
+              <w:t xml:space="preserve"> </w:t>
+            </w:r>
+            <w:r>
+              <w:rPr>
+                <w:rFonts w:ascii="Times New Roman" w:hAnsi="Times New Roman" w:cs="Times New Roman"/>
+                <w:sz w:val="24"/>
+              </w:rPr>
+              <w:t>с</w:t>
+            </w:r>
+            <w:r>
+              <w:rPr>
+                <w:rFonts w:ascii="Times New Roman" w:hAnsi="Times New Roman" w:cs="Times New Roman"/>
+                <w:sz w:val="24"/>
+              </w:rPr>
+              <w:t xml:space="preserve"> несколькими словами</w:t>
+            </w:r>
+          </w:p>
+        </w:tc>
+        <w:tc>
+          <w:tcPr>
+            <w:tcW w:w="3115" w:type="dxa"/>
+            <w:shd w:val="clear" w:color="auto" w:fill="92D050"/>
+          </w:tcPr>
+          <w:p>
+            <w:pPr>
+              <w:rPr>
+                <w:rFonts w:ascii="Times New Roman" w:hAnsi="Times New Roman" w:cs="Times New Roman"/>
+                <w:sz w:val="24"/>
+              </w:rPr>
+            </w:pPr>
+            <w:r>
+              <w:rPr>
+                <w:rFonts w:ascii="Times New Roman" w:hAnsi="Times New Roman" w:cs="Times New Roman"/>
+                <w:sz w:val="24"/>
+              </w:rPr>
+              <w:t>Возвращается положительное число</w:t>
+            </w:r>
+          </w:p>
+        </w:tc>
+      </w:tr>
+    </w:tbl>
+    <w:p>
+      <w:pPr>
         <w:rPr>
           <w:rFonts w:ascii="Times New Roman" w:hAnsi="Times New Roman" w:cs="Times New Roman"/>
           <w:sz w:val="24"/>
@@ -1778,7 +2160,6 @@
         <w:rPr>
           <w:rFonts w:ascii="Times New Roman" w:hAnsi="Times New Roman" w:cs="Times New Roman"/>
           <w:sz w:val="24"/>
-          <w:lang w:val="en-US"/>
         </w:rPr>
       </w:pPr>
       <w:bookmarkStart w:id="0" w:name="_GoBack"/>

</xml_diff>

<commit_message>
add test raw extraction documentation
</commit_message>
<xml_diff>
--- a/tests/doc/test_cases.docx
+++ b/tests/doc/test_cases.docx
@@ -71,6 +71,7 @@
           <w:sz w:val="24"/>
         </w:rPr>
       </w:pPr>
+      <w:proofErr w:type="spellStart"/>
       <w:r>
         <w:rPr>
           <w:rFonts w:ascii="Times New Roman" w:hAnsi="Times New Roman" w:cs="Times New Roman"/>
@@ -79,6 +80,30 @@
         </w:rPr>
         <w:t>get_comments</w:t>
       </w:r>
+      <w:proofErr w:type="spellEnd"/>
+    </w:p>
+    <w:p>
+      <w:pPr>
+        <w:pStyle w:val="a3"/>
+        <w:numPr>
+          <w:ilvl w:val="0"/>
+          <w:numId w:val="1"/>
+        </w:numPr>
+        <w:rPr>
+          <w:rFonts w:ascii="Times New Roman" w:hAnsi="Times New Roman" w:cs="Times New Roman"/>
+          <w:sz w:val="24"/>
+        </w:rPr>
+      </w:pPr>
+      <w:proofErr w:type="spellStart"/>
+      <w:r>
+        <w:rPr>
+          <w:rFonts w:ascii="Times New Roman" w:hAnsi="Times New Roman" w:cs="Times New Roman"/>
+          <w:sz w:val="24"/>
+          <w:lang w:val="en-US"/>
+        </w:rPr>
+        <w:t>extract_raw_text</w:t>
+      </w:r>
+      <w:proofErr w:type="spellEnd"/>
     </w:p>
     <w:p>
       <w:pPr>
@@ -1499,6 +1524,7 @@
           <w:rFonts w:ascii="Times New Roman" w:hAnsi="Times New Roman" w:cs="Times New Roman"/>
           <w:sz w:val="24"/>
         </w:rPr>
+        <w:lastRenderedPageBreak/>
         <w:t xml:space="preserve">Тестирование </w:t>
       </w:r>
       <w:r>
@@ -1539,7 +1565,6 @@
                 <w:rFonts w:ascii="Times New Roman" w:hAnsi="Times New Roman" w:cs="Times New Roman"/>
                 <w:sz w:val="24"/>
               </w:rPr>
-              <w:lastRenderedPageBreak/>
               <w:t>Комментарий с низкой энтропией</w:t>
             </w:r>
           </w:p>
@@ -1993,14 +2018,7 @@
                 <w:rFonts w:ascii="Times New Roman" w:hAnsi="Times New Roman" w:cs="Times New Roman"/>
                 <w:sz w:val="24"/>
               </w:rPr>
-              <w:t>с</w:t>
-            </w:r>
-            <w:r>
-              <w:rPr>
-                <w:rFonts w:ascii="Times New Roman" w:hAnsi="Times New Roman" w:cs="Times New Roman"/>
-                <w:sz w:val="24"/>
-              </w:rPr>
-              <w:t xml:space="preserve"> одним словом</w:t>
+              <w:t>с одним словом</w:t>
             </w:r>
           </w:p>
         </w:tc>
@@ -2113,14 +2131,7 @@
                 <w:rFonts w:ascii="Times New Roman" w:hAnsi="Times New Roman" w:cs="Times New Roman"/>
                 <w:sz w:val="24"/>
               </w:rPr>
-              <w:t>с</w:t>
-            </w:r>
-            <w:r>
-              <w:rPr>
-                <w:rFonts w:ascii="Times New Roman" w:hAnsi="Times New Roman" w:cs="Times New Roman"/>
-                <w:sz w:val="24"/>
-              </w:rPr>
-              <w:t xml:space="preserve"> несколькими словами</w:t>
+              <w:t>с несколькими словами</w:t>
             </w:r>
           </w:p>
         </w:tc>
@@ -2142,6 +2153,382 @@
                 <w:sz w:val="24"/>
               </w:rPr>
               <w:t>Возвращается положительное число</w:t>
+            </w:r>
+          </w:p>
+        </w:tc>
+      </w:tr>
+    </w:tbl>
+    <w:p>
+      <w:pPr>
+        <w:rPr>
+          <w:rFonts w:ascii="Times New Roman" w:hAnsi="Times New Roman" w:cs="Times New Roman"/>
+          <w:sz w:val="24"/>
+        </w:rPr>
+      </w:pPr>
+    </w:p>
+    <w:p>
+      <w:pPr>
+        <w:jc w:val="center"/>
+        <w:rPr>
+          <w:rFonts w:ascii="Times New Roman" w:hAnsi="Times New Roman" w:cs="Times New Roman"/>
+          <w:sz w:val="24"/>
+          <w:lang w:val="en-US"/>
+        </w:rPr>
+      </w:pPr>
+      <w:r>
+        <w:rPr>
+          <w:rFonts w:ascii="Times New Roman" w:hAnsi="Times New Roman" w:cs="Times New Roman"/>
+          <w:sz w:val="24"/>
+        </w:rPr>
+        <w:t xml:space="preserve">Тестирование </w:t>
+      </w:r>
+      <w:proofErr w:type="spellStart"/>
+      <w:r>
+        <w:rPr>
+          <w:rFonts w:ascii="Times New Roman" w:hAnsi="Times New Roman" w:cs="Times New Roman"/>
+          <w:sz w:val="24"/>
+          <w:lang w:val="en-US"/>
+        </w:rPr>
+        <w:t>extract_raw_text</w:t>
+      </w:r>
+      <w:proofErr w:type="spellEnd"/>
+    </w:p>
+    <w:tbl>
+      <w:tblPr>
+        <w:tblStyle w:val="a4"/>
+        <w:tblW w:w="0" w:type="auto"/>
+        <w:tblLook w:val="04A0" w:firstRow="1" w:lastRow="0" w:firstColumn="1" w:lastColumn="0" w:noHBand="0" w:noVBand="1"/>
+      </w:tblPr>
+      <w:tblGrid>
+        <w:gridCol w:w="3115"/>
+        <w:gridCol w:w="3115"/>
+        <w:gridCol w:w="3115"/>
+      </w:tblGrid>
+      <w:tr>
+        <w:tc>
+          <w:tcPr>
+            <w:tcW w:w="3115" w:type="dxa"/>
+            <w:shd w:val="clear" w:color="auto" w:fill="92D050"/>
+          </w:tcPr>
+          <w:p>
+            <w:pPr>
+              <w:rPr>
+                <w:rFonts w:ascii="Times New Roman" w:hAnsi="Times New Roman" w:cs="Times New Roman"/>
+                <w:sz w:val="24"/>
+              </w:rPr>
+            </w:pPr>
+            <w:r>
+              <w:rPr>
+                <w:rFonts w:ascii="Times New Roman" w:hAnsi="Times New Roman" w:cs="Times New Roman"/>
+                <w:sz w:val="24"/>
+              </w:rPr>
+              <w:t xml:space="preserve">Удаляются </w:t>
+            </w:r>
+            <w:r>
+              <w:rPr>
+                <w:rFonts w:ascii="Times New Roman" w:hAnsi="Times New Roman" w:cs="Times New Roman"/>
+                <w:sz w:val="24"/>
+                <w:lang w:val="en-US"/>
+              </w:rPr>
+              <w:t xml:space="preserve">script </w:t>
+            </w:r>
+            <w:r>
+              <w:rPr>
+                <w:rFonts w:ascii="Times New Roman" w:hAnsi="Times New Roman" w:cs="Times New Roman"/>
+                <w:sz w:val="24"/>
+              </w:rPr>
+              <w:t xml:space="preserve">и </w:t>
+            </w:r>
+            <w:r>
+              <w:rPr>
+                <w:rFonts w:ascii="Times New Roman" w:hAnsi="Times New Roman" w:cs="Times New Roman"/>
+                <w:sz w:val="24"/>
+                <w:lang w:val="en-US"/>
+              </w:rPr>
+              <w:t>style</w:t>
+            </w:r>
+          </w:p>
+        </w:tc>
+        <w:tc>
+          <w:tcPr>
+            <w:tcW w:w="3115" w:type="dxa"/>
+            <w:shd w:val="clear" w:color="auto" w:fill="92D050"/>
+          </w:tcPr>
+          <w:p>
+            <w:pPr>
+              <w:rPr>
+                <w:rFonts w:ascii="Times New Roman" w:hAnsi="Times New Roman" w:cs="Times New Roman"/>
+                <w:sz w:val="24"/>
+              </w:rPr>
+            </w:pPr>
+            <w:r>
+              <w:rPr>
+                <w:rFonts w:ascii="Times New Roman" w:hAnsi="Times New Roman" w:cs="Times New Roman"/>
+                <w:sz w:val="24"/>
+              </w:rPr>
+              <w:t xml:space="preserve">1. </w:t>
+            </w:r>
+            <w:r>
+              <w:rPr>
+                <w:rFonts w:ascii="Times New Roman" w:hAnsi="Times New Roman" w:cs="Times New Roman"/>
+                <w:sz w:val="24"/>
+              </w:rPr>
+              <w:t xml:space="preserve">Передать </w:t>
+            </w:r>
+            <w:r>
+              <w:rPr>
+                <w:rFonts w:ascii="Times New Roman" w:hAnsi="Times New Roman" w:cs="Times New Roman"/>
+                <w:sz w:val="24"/>
+                <w:lang w:val="en-US"/>
+              </w:rPr>
+              <w:t>HTML</w:t>
+            </w:r>
+            <w:r>
+              <w:rPr>
+                <w:rFonts w:ascii="Times New Roman" w:hAnsi="Times New Roman" w:cs="Times New Roman"/>
+                <w:sz w:val="24"/>
+              </w:rPr>
+              <w:t xml:space="preserve"> со </w:t>
+            </w:r>
+            <w:r>
+              <w:rPr>
+                <w:rFonts w:ascii="Times New Roman" w:hAnsi="Times New Roman" w:cs="Times New Roman"/>
+                <w:sz w:val="24"/>
+                <w:lang w:val="en-US"/>
+              </w:rPr>
+              <w:t>script</w:t>
+            </w:r>
+            <w:r>
+              <w:rPr>
+                <w:rFonts w:ascii="Times New Roman" w:hAnsi="Times New Roman" w:cs="Times New Roman"/>
+                <w:sz w:val="24"/>
+              </w:rPr>
+              <w:t xml:space="preserve"> </w:t>
+            </w:r>
+            <w:r>
+              <w:rPr>
+                <w:rFonts w:ascii="Times New Roman" w:hAnsi="Times New Roman" w:cs="Times New Roman"/>
+                <w:sz w:val="24"/>
+              </w:rPr>
+              <w:t xml:space="preserve">и </w:t>
+            </w:r>
+            <w:r>
+              <w:rPr>
+                <w:rFonts w:ascii="Times New Roman" w:hAnsi="Times New Roman" w:cs="Times New Roman"/>
+                <w:sz w:val="24"/>
+                <w:lang w:val="en-US"/>
+              </w:rPr>
+              <w:t>style</w:t>
+            </w:r>
+          </w:p>
+          <w:p>
+            <w:pPr>
+              <w:rPr>
+                <w:rFonts w:ascii="Times New Roman" w:hAnsi="Times New Roman" w:cs="Times New Roman"/>
+                <w:sz w:val="24"/>
+                <w:lang w:val="en-US"/>
+              </w:rPr>
+            </w:pPr>
+            <w:r>
+              <w:rPr>
+                <w:rFonts w:ascii="Times New Roman" w:hAnsi="Times New Roman" w:cs="Times New Roman"/>
+                <w:sz w:val="24"/>
+              </w:rPr>
+              <w:t xml:space="preserve">2. Вызвать </w:t>
+            </w:r>
+            <w:proofErr w:type="spellStart"/>
+            <w:r>
+              <w:rPr>
+                <w:rFonts w:ascii="Times New Roman" w:hAnsi="Times New Roman" w:cs="Times New Roman"/>
+                <w:sz w:val="24"/>
+                <w:lang w:val="en-US"/>
+              </w:rPr>
+              <w:t>extract_raw_text</w:t>
+            </w:r>
+            <w:proofErr w:type="spellEnd"/>
+          </w:p>
+        </w:tc>
+        <w:tc>
+          <w:tcPr>
+            <w:tcW w:w="3115" w:type="dxa"/>
+            <w:shd w:val="clear" w:color="auto" w:fill="92D050"/>
+          </w:tcPr>
+          <w:p>
+            <w:pPr>
+              <w:rPr>
+                <w:rFonts w:ascii="Times New Roman" w:hAnsi="Times New Roman" w:cs="Times New Roman"/>
+                <w:sz w:val="24"/>
+              </w:rPr>
+            </w:pPr>
+            <w:r>
+              <w:rPr>
+                <w:rFonts w:ascii="Times New Roman" w:hAnsi="Times New Roman" w:cs="Times New Roman"/>
+                <w:sz w:val="24"/>
+              </w:rPr>
+              <w:t>Текст из</w:t>
+            </w:r>
+            <w:r>
+              <w:rPr>
+                <w:rFonts w:ascii="Times New Roman" w:hAnsi="Times New Roman" w:cs="Times New Roman"/>
+                <w:sz w:val="24"/>
+              </w:rPr>
+              <w:t xml:space="preserve"> </w:t>
+            </w:r>
+            <w:r>
+              <w:rPr>
+                <w:rFonts w:ascii="Times New Roman" w:hAnsi="Times New Roman" w:cs="Times New Roman"/>
+                <w:sz w:val="24"/>
+                <w:lang w:val="en-US"/>
+              </w:rPr>
+              <w:t>script</w:t>
+            </w:r>
+            <w:r>
+              <w:rPr>
+                <w:rFonts w:ascii="Times New Roman" w:hAnsi="Times New Roman" w:cs="Times New Roman"/>
+                <w:sz w:val="24"/>
+              </w:rPr>
+              <w:t xml:space="preserve"> </w:t>
+            </w:r>
+            <w:r>
+              <w:rPr>
+                <w:rFonts w:ascii="Times New Roman" w:hAnsi="Times New Roman" w:cs="Times New Roman"/>
+                <w:sz w:val="24"/>
+              </w:rPr>
+              <w:t xml:space="preserve">и </w:t>
+            </w:r>
+            <w:r>
+              <w:rPr>
+                <w:rFonts w:ascii="Times New Roman" w:hAnsi="Times New Roman" w:cs="Times New Roman"/>
+                <w:sz w:val="24"/>
+                <w:lang w:val="en-US"/>
+              </w:rPr>
+              <w:t>style</w:t>
+            </w:r>
+            <w:r>
+              <w:rPr>
+                <w:rFonts w:ascii="Times New Roman" w:hAnsi="Times New Roman" w:cs="Times New Roman"/>
+                <w:sz w:val="24"/>
+              </w:rPr>
+              <w:t xml:space="preserve"> </w:t>
+            </w:r>
+            <w:r>
+              <w:rPr>
+                <w:rFonts w:ascii="Times New Roman" w:hAnsi="Times New Roman" w:cs="Times New Roman"/>
+                <w:sz w:val="24"/>
+              </w:rPr>
+              <w:t>отсутствует в результате</w:t>
+            </w:r>
+          </w:p>
+        </w:tc>
+      </w:tr>
+      <w:tr>
+        <w:tc>
+          <w:tcPr>
+            <w:tcW w:w="3115" w:type="dxa"/>
+            <w:shd w:val="clear" w:color="auto" w:fill="92D050"/>
+          </w:tcPr>
+          <w:p>
+            <w:pPr>
+              <w:rPr>
+                <w:rFonts w:ascii="Times New Roman" w:hAnsi="Times New Roman" w:cs="Times New Roman"/>
+                <w:sz w:val="24"/>
+              </w:rPr>
+            </w:pPr>
+            <w:r>
+              <w:rPr>
+                <w:rFonts w:ascii="Times New Roman" w:hAnsi="Times New Roman" w:cs="Times New Roman"/>
+                <w:sz w:val="24"/>
+              </w:rPr>
+              <w:t>Возвращается очищенный текст страницы</w:t>
+            </w:r>
+          </w:p>
+        </w:tc>
+        <w:tc>
+          <w:tcPr>
+            <w:tcW w:w="3115" w:type="dxa"/>
+            <w:shd w:val="clear" w:color="auto" w:fill="92D050"/>
+          </w:tcPr>
+          <w:p>
+            <w:pPr>
+              <w:rPr>
+                <w:rFonts w:ascii="Times New Roman" w:hAnsi="Times New Roman" w:cs="Times New Roman"/>
+                <w:sz w:val="24"/>
+              </w:rPr>
+            </w:pPr>
+            <w:r>
+              <w:rPr>
+                <w:rFonts w:ascii="Times New Roman" w:hAnsi="Times New Roman" w:cs="Times New Roman"/>
+                <w:sz w:val="24"/>
+              </w:rPr>
+              <w:t xml:space="preserve">1. Передать </w:t>
+            </w:r>
+            <w:r>
+              <w:rPr>
+                <w:rFonts w:ascii="Times New Roman" w:hAnsi="Times New Roman" w:cs="Times New Roman"/>
+                <w:sz w:val="24"/>
+                <w:lang w:val="en-US"/>
+              </w:rPr>
+              <w:t>HTML</w:t>
+            </w:r>
+            <w:r>
+              <w:rPr>
+                <w:rFonts w:ascii="Times New Roman" w:hAnsi="Times New Roman" w:cs="Times New Roman"/>
+                <w:sz w:val="24"/>
+              </w:rPr>
+              <w:t xml:space="preserve"> с обычным текстом</w:t>
+            </w:r>
+          </w:p>
+          <w:p>
+            <w:pPr>
+              <w:rPr>
+                <w:rFonts w:ascii="Times New Roman" w:hAnsi="Times New Roman" w:cs="Times New Roman"/>
+                <w:sz w:val="24"/>
+              </w:rPr>
+            </w:pPr>
+            <w:r>
+              <w:rPr>
+                <w:rFonts w:ascii="Times New Roman" w:hAnsi="Times New Roman" w:cs="Times New Roman"/>
+                <w:sz w:val="24"/>
+              </w:rPr>
+              <w:t xml:space="preserve">2. </w:t>
+            </w:r>
+            <w:r>
+              <w:rPr>
+                <w:rFonts w:ascii="Times New Roman" w:hAnsi="Times New Roman" w:cs="Times New Roman"/>
+                <w:sz w:val="24"/>
+              </w:rPr>
+              <w:t xml:space="preserve">Вызывать </w:t>
+            </w:r>
+            <w:proofErr w:type="spellStart"/>
+            <w:r>
+              <w:rPr>
+                <w:rFonts w:ascii="Times New Roman" w:hAnsi="Times New Roman" w:cs="Times New Roman"/>
+                <w:sz w:val="24"/>
+                <w:lang w:val="en-US"/>
+              </w:rPr>
+              <w:t>extract_raw_text</w:t>
+            </w:r>
+            <w:proofErr w:type="spellEnd"/>
+          </w:p>
+        </w:tc>
+        <w:tc>
+          <w:tcPr>
+            <w:tcW w:w="3115" w:type="dxa"/>
+            <w:shd w:val="clear" w:color="auto" w:fill="92D050"/>
+          </w:tcPr>
+          <w:p>
+            <w:pPr>
+              <w:rPr>
+                <w:rFonts w:ascii="Times New Roman" w:hAnsi="Times New Roman" w:cs="Times New Roman"/>
+                <w:sz w:val="24"/>
+              </w:rPr>
+            </w:pPr>
+            <w:r>
+              <w:rPr>
+                <w:rFonts w:ascii="Times New Roman" w:hAnsi="Times New Roman" w:cs="Times New Roman"/>
+                <w:sz w:val="24"/>
+              </w:rPr>
+              <w:t>Функция возвращает строку с текстом страницы (без пустых строк и лишних пробелов)</w:t>
             </w:r>
           </w:p>
         </w:tc>

</xml_diff>

<commit_message>
add test integration documantation
</commit_message>
<xml_diff>
--- a/tests/doc/test_cases.docx
+++ b/tests/doc/test_cases.docx
@@ -71,7 +71,6 @@
           <w:sz w:val="24"/>
         </w:rPr>
       </w:pPr>
-      <w:proofErr w:type="spellStart"/>
       <w:r>
         <w:rPr>
           <w:rFonts w:ascii="Times New Roman" w:hAnsi="Times New Roman" w:cs="Times New Roman"/>
@@ -80,7 +79,6 @@
         </w:rPr>
         <w:t>get_comments</w:t>
       </w:r>
-      <w:proofErr w:type="spellEnd"/>
     </w:p>
     <w:p>
       <w:pPr>
@@ -1762,7 +1760,6 @@
         </w:rPr>
         <w:t xml:space="preserve">Тестирование </w:t>
       </w:r>
-      <w:proofErr w:type="spellStart"/>
       <w:r>
         <w:rPr>
           <w:rFonts w:ascii="Times New Roman" w:hAnsi="Times New Roman" w:cs="Times New Roman"/>
@@ -1771,7 +1768,6 @@
         </w:rPr>
         <w:t>russian</w:t>
       </w:r>
-      <w:proofErr w:type="spellEnd"/>
       <w:r>
         <w:rPr>
           <w:rFonts w:ascii="Times New Roman" w:hAnsi="Times New Roman" w:cs="Times New Roman"/>
@@ -1847,7 +1843,6 @@
               </w:rPr>
               <w:t xml:space="preserve">1. Вызывать </w:t>
             </w:r>
-            <w:proofErr w:type="spellStart"/>
             <w:r>
               <w:rPr>
                 <w:rFonts w:ascii="Times New Roman" w:hAnsi="Times New Roman" w:cs="Times New Roman"/>
@@ -1856,7 +1851,6 @@
               </w:rPr>
               <w:t>russian</w:t>
             </w:r>
-            <w:proofErr w:type="spellEnd"/>
             <w:r>
               <w:rPr>
                 <w:rFonts w:ascii="Times New Roman" w:hAnsi="Times New Roman" w:cs="Times New Roman"/>
@@ -1981,7 +1975,6 @@
               </w:rPr>
               <w:t xml:space="preserve">1. Вызывать </w:t>
             </w:r>
-            <w:proofErr w:type="spellStart"/>
             <w:r>
               <w:rPr>
                 <w:rFonts w:ascii="Times New Roman" w:hAnsi="Times New Roman" w:cs="Times New Roman"/>
@@ -1990,7 +1983,6 @@
               </w:rPr>
               <w:t>russian</w:t>
             </w:r>
-            <w:proofErr w:type="spellEnd"/>
             <w:r>
               <w:rPr>
                 <w:rFonts w:ascii="Times New Roman" w:hAnsi="Times New Roman" w:cs="Times New Roman"/>
@@ -2094,7 +2086,6 @@
               </w:rPr>
               <w:t xml:space="preserve">1. Вызывать </w:t>
             </w:r>
-            <w:proofErr w:type="spellStart"/>
             <w:r>
               <w:rPr>
                 <w:rFonts w:ascii="Times New Roman" w:hAnsi="Times New Roman" w:cs="Times New Roman"/>
@@ -2103,7 +2094,6 @@
               </w:rPr>
               <w:t>russian</w:t>
             </w:r>
-            <w:proofErr w:type="spellEnd"/>
             <w:r>
               <w:rPr>
                 <w:rFonts w:ascii="Times New Roman" w:hAnsi="Times New Roman" w:cs="Times New Roman"/>
@@ -2182,7 +2172,6 @@
         </w:rPr>
         <w:t xml:space="preserve">Тестирование </w:t>
       </w:r>
-      <w:proofErr w:type="spellStart"/>
       <w:r>
         <w:rPr>
           <w:rFonts w:ascii="Times New Roman" w:hAnsi="Times New Roman" w:cs="Times New Roman"/>
@@ -2191,7 +2180,6 @@
         </w:rPr>
         <w:t>extract_raw_text</w:t>
       </w:r>
-      <w:proofErr w:type="spellEnd"/>
     </w:p>
     <w:tbl>
       <w:tblPr>
@@ -2336,7 +2324,6 @@
               </w:rPr>
               <w:t xml:space="preserve">2. Вызвать </w:t>
             </w:r>
-            <w:proofErr w:type="spellStart"/>
             <w:r>
               <w:rPr>
                 <w:rFonts w:ascii="Times New Roman" w:hAnsi="Times New Roman" w:cs="Times New Roman"/>
@@ -2345,7 +2332,6 @@
               </w:rPr>
               <w:t>extract_raw_text</w:t>
             </w:r>
-            <w:proofErr w:type="spellEnd"/>
           </w:p>
         </w:tc>
         <w:tc>
@@ -2499,16 +2485,44 @@
               </w:rPr>
               <w:t xml:space="preserve">Вызывать </w:t>
             </w:r>
-            <w:proofErr w:type="spellStart"/>
-            <w:r>
-              <w:rPr>
-                <w:rFonts w:ascii="Times New Roman" w:hAnsi="Times New Roman" w:cs="Times New Roman"/>
-                <w:sz w:val="24"/>
-                <w:lang w:val="en-US"/>
-              </w:rPr>
-              <w:t>extract_raw_text</w:t>
-            </w:r>
-            <w:proofErr w:type="spellEnd"/>
+            <w:r>
+              <w:rPr>
+                <w:rFonts w:ascii="Times New Roman" w:hAnsi="Times New Roman" w:cs="Times New Roman"/>
+                <w:sz w:val="24"/>
+                <w:lang w:val="en-US"/>
+              </w:rPr>
+              <w:t>extract</w:t>
+            </w:r>
+            <w:r>
+              <w:rPr>
+                <w:rFonts w:ascii="Times New Roman" w:hAnsi="Times New Roman" w:cs="Times New Roman"/>
+                <w:sz w:val="24"/>
+              </w:rPr>
+              <w:t>_</w:t>
+            </w:r>
+            <w:r>
+              <w:rPr>
+                <w:rFonts w:ascii="Times New Roman" w:hAnsi="Times New Roman" w:cs="Times New Roman"/>
+                <w:sz w:val="24"/>
+                <w:lang w:val="en-US"/>
+              </w:rPr>
+              <w:t>raw</w:t>
+            </w:r>
+            <w:r>
+              <w:rPr>
+                <w:rFonts w:ascii="Times New Roman" w:hAnsi="Times New Roman" w:cs="Times New Roman"/>
+                <w:sz w:val="24"/>
+              </w:rPr>
+              <w:t>_</w:t>
+            </w:r>
+            <w:r>
+              <w:rPr>
+                <w:rFonts w:ascii="Times New Roman" w:hAnsi="Times New Roman" w:cs="Times New Roman"/>
+                <w:sz w:val="24"/>
+                <w:lang w:val="en-US"/>
+              </w:rPr>
+              <w:t>text</w:t>
+            </w:r>
           </w:p>
         </w:tc>
         <w:tc>
@@ -2544,13 +2558,889 @@
     </w:p>
     <w:p>
       <w:pPr>
-        <w:rPr>
-          <w:rFonts w:ascii="Times New Roman" w:hAnsi="Times New Roman" w:cs="Times New Roman"/>
+        <w:jc w:val="center"/>
+        <w:rPr>
+          <w:rFonts w:ascii="Times New Roman" w:hAnsi="Times New Roman" w:cs="Times New Roman"/>
+          <w:b/>
           <w:sz w:val="24"/>
         </w:rPr>
       </w:pPr>
+      <w:r>
+        <w:rPr>
+          <w:rFonts w:ascii="Times New Roman" w:hAnsi="Times New Roman" w:cs="Times New Roman"/>
+          <w:b/>
+          <w:sz w:val="24"/>
+        </w:rPr>
+        <w:t>Интеграционные тесты</w:t>
+      </w:r>
+    </w:p>
+    <w:p>
+      <w:pPr>
+        <w:jc w:val="center"/>
+        <w:rPr>
+          <w:rFonts w:ascii="Times New Roman" w:hAnsi="Times New Roman" w:cs="Times New Roman"/>
+          <w:sz w:val="24"/>
+        </w:rPr>
+      </w:pPr>
+      <w:r>
+        <w:rPr>
+          <w:rFonts w:ascii="Times New Roman" w:hAnsi="Times New Roman" w:cs="Times New Roman"/>
+          <w:sz w:val="24"/>
+        </w:rPr>
+        <w:t xml:space="preserve">Проверить, что приложение работает как единая система: </w:t>
+      </w:r>
+      <w:proofErr w:type="spellStart"/>
+      <w:r>
+        <w:rPr>
+          <w:rFonts w:ascii="Times New Roman" w:hAnsi="Times New Roman" w:cs="Times New Roman"/>
+          <w:sz w:val="24"/>
+        </w:rPr>
+        <w:t>Config</w:t>
+      </w:r>
+      <w:proofErr w:type="spellEnd"/>
+      <w:r>
+        <w:rPr>
+          <w:rFonts w:ascii="Times New Roman" w:hAnsi="Times New Roman" w:cs="Times New Roman"/>
+          <w:sz w:val="24"/>
+        </w:rPr>
+        <w:t xml:space="preserve"> - загрузка страницы - </w:t>
+      </w:r>
+      <w:proofErr w:type="spellStart"/>
+      <w:r>
+        <w:rPr>
+          <w:rFonts w:ascii="Times New Roman" w:hAnsi="Times New Roman" w:cs="Times New Roman"/>
+          <w:sz w:val="24"/>
+        </w:rPr>
+        <w:t>парсинг</w:t>
+      </w:r>
+      <w:proofErr w:type="spellEnd"/>
+      <w:r>
+        <w:rPr>
+          <w:rFonts w:ascii="Times New Roman" w:hAnsi="Times New Roman" w:cs="Times New Roman"/>
+          <w:sz w:val="24"/>
+        </w:rPr>
+        <w:t xml:space="preserve"> комментарие</w:t>
+      </w:r>
       <w:bookmarkStart w:id="0" w:name="_GoBack"/>
       <w:bookmarkEnd w:id="0"/>
+      <w:r>
+        <w:rPr>
+          <w:rFonts w:ascii="Times New Roman" w:hAnsi="Times New Roman" w:cs="Times New Roman"/>
+          <w:sz w:val="24"/>
+        </w:rPr>
+        <w:t xml:space="preserve">в - анализ - </w:t>
+      </w:r>
+      <w:r>
+        <w:rPr>
+          <w:rFonts w:ascii="Times New Roman" w:hAnsi="Times New Roman" w:cs="Times New Roman"/>
+          <w:sz w:val="24"/>
+        </w:rPr>
+        <w:t>сохранение в JSON</w:t>
+      </w:r>
+      <w:r>
+        <w:rPr>
+          <w:rFonts w:ascii="Times New Roman" w:hAnsi="Times New Roman" w:cs="Times New Roman"/>
+          <w:sz w:val="24"/>
+        </w:rPr>
+        <w:t>.</w:t>
+      </w:r>
+    </w:p>
+    <w:tbl>
+      <w:tblPr>
+        <w:tblStyle w:val="a4"/>
+        <w:tblW w:w="0" w:type="auto"/>
+        <w:tblLook w:val="04A0" w:firstRow="1" w:lastRow="0" w:firstColumn="1" w:lastColumn="0" w:noHBand="0" w:noVBand="1"/>
+      </w:tblPr>
+      <w:tblGrid>
+        <w:gridCol w:w="3103"/>
+        <w:gridCol w:w="3136"/>
+        <w:gridCol w:w="3106"/>
+      </w:tblGrid>
+      <w:tr>
+        <w:tc>
+          <w:tcPr>
+            <w:tcW w:w="3115" w:type="dxa"/>
+            <w:shd w:val="clear" w:color="auto" w:fill="92D050"/>
+          </w:tcPr>
+          <w:p>
+            <w:pPr>
+              <w:rPr>
+                <w:rFonts w:ascii="Times New Roman" w:hAnsi="Times New Roman" w:cs="Times New Roman"/>
+                <w:sz w:val="24"/>
+              </w:rPr>
+            </w:pPr>
+            <w:r>
+              <w:rPr>
+                <w:rFonts w:ascii="Times New Roman" w:hAnsi="Times New Roman" w:cs="Times New Roman"/>
+                <w:sz w:val="24"/>
+              </w:rPr>
+              <w:t xml:space="preserve">Полный сценарий: загрузка, </w:t>
+            </w:r>
+            <w:proofErr w:type="spellStart"/>
+            <w:r>
+              <w:rPr>
+                <w:rFonts w:ascii="Times New Roman" w:hAnsi="Times New Roman" w:cs="Times New Roman"/>
+                <w:sz w:val="24"/>
+              </w:rPr>
+              <w:t>парсинг</w:t>
+            </w:r>
+            <w:proofErr w:type="spellEnd"/>
+            <w:r>
+              <w:rPr>
+                <w:rFonts w:ascii="Times New Roman" w:hAnsi="Times New Roman" w:cs="Times New Roman"/>
+                <w:sz w:val="24"/>
+              </w:rPr>
+              <w:t>, сохранение</w:t>
+            </w:r>
+          </w:p>
+        </w:tc>
+        <w:tc>
+          <w:tcPr>
+            <w:tcW w:w="3115" w:type="dxa"/>
+            <w:shd w:val="clear" w:color="auto" w:fill="92D050"/>
+          </w:tcPr>
+          <w:p>
+            <w:pPr>
+              <w:rPr>
+                <w:rFonts w:ascii="Times New Roman" w:hAnsi="Times New Roman" w:cs="Times New Roman"/>
+                <w:sz w:val="24"/>
+              </w:rPr>
+            </w:pPr>
+            <w:r>
+              <w:rPr>
+                <w:rFonts w:ascii="Times New Roman" w:hAnsi="Times New Roman" w:cs="Times New Roman"/>
+                <w:sz w:val="24"/>
+              </w:rPr>
+              <w:t>1. Загрузить</w:t>
+            </w:r>
+            <w:r>
+              <w:rPr>
+                <w:rFonts w:ascii="Times New Roman" w:hAnsi="Times New Roman" w:cs="Times New Roman"/>
+                <w:sz w:val="24"/>
+              </w:rPr>
+              <w:t xml:space="preserve"> HTTP-ответ страницы </w:t>
+            </w:r>
+          </w:p>
+          <w:p>
+            <w:pPr>
+              <w:rPr>
+                <w:rFonts w:ascii="Times New Roman" w:hAnsi="Times New Roman" w:cs="Times New Roman"/>
+                <w:sz w:val="24"/>
+              </w:rPr>
+            </w:pPr>
+            <w:r>
+              <w:rPr>
+                <w:rFonts w:ascii="Times New Roman" w:hAnsi="Times New Roman" w:cs="Times New Roman"/>
+                <w:sz w:val="24"/>
+              </w:rPr>
+              <w:t xml:space="preserve">2. Вызвать </w:t>
+            </w:r>
+            <w:r>
+              <w:rPr>
+                <w:rFonts w:ascii="Times New Roman" w:hAnsi="Times New Roman" w:cs="Times New Roman"/>
+                <w:sz w:val="24"/>
+                <w:lang w:val="en-US"/>
+              </w:rPr>
+              <w:t>habr</w:t>
+            </w:r>
+            <w:r>
+              <w:rPr>
+                <w:rFonts w:ascii="Times New Roman" w:hAnsi="Times New Roman" w:cs="Times New Roman"/>
+                <w:sz w:val="24"/>
+              </w:rPr>
+              <w:t>_</w:t>
+            </w:r>
+            <w:r>
+              <w:rPr>
+                <w:rFonts w:ascii="Times New Roman" w:hAnsi="Times New Roman" w:cs="Times New Roman"/>
+                <w:sz w:val="24"/>
+                <w:lang w:val="en-US"/>
+              </w:rPr>
+              <w:t>get</w:t>
+            </w:r>
+            <w:r>
+              <w:rPr>
+                <w:rFonts w:ascii="Times New Roman" w:hAnsi="Times New Roman" w:cs="Times New Roman"/>
+                <w:sz w:val="24"/>
+              </w:rPr>
+              <w:t>_</w:t>
+            </w:r>
+            <w:r>
+              <w:rPr>
+                <w:rFonts w:ascii="Times New Roman" w:hAnsi="Times New Roman" w:cs="Times New Roman"/>
+                <w:sz w:val="24"/>
+                <w:lang w:val="en-US"/>
+              </w:rPr>
+              <w:t>comments</w:t>
+            </w:r>
+            <w:r>
+              <w:rPr>
+                <w:rFonts w:ascii="Times New Roman" w:hAnsi="Times New Roman" w:cs="Times New Roman"/>
+                <w:sz w:val="24"/>
+              </w:rPr>
+              <w:t>_</w:t>
+            </w:r>
+            <w:r>
+              <w:rPr>
+                <w:rFonts w:ascii="Times New Roman" w:hAnsi="Times New Roman" w:cs="Times New Roman"/>
+                <w:sz w:val="24"/>
+                <w:lang w:val="en-US"/>
+              </w:rPr>
+              <w:t>from</w:t>
+            </w:r>
+            <w:r>
+              <w:rPr>
+                <w:rFonts w:ascii="Times New Roman" w:hAnsi="Times New Roman" w:cs="Times New Roman"/>
+                <w:sz w:val="24"/>
+              </w:rPr>
+              <w:t>_</w:t>
+            </w:r>
+            <w:proofErr w:type="spellStart"/>
+            <w:r>
+              <w:rPr>
+                <w:rFonts w:ascii="Times New Roman" w:hAnsi="Times New Roman" w:cs="Times New Roman"/>
+                <w:sz w:val="24"/>
+                <w:lang w:val="en-US"/>
+              </w:rPr>
+              <w:t>url</w:t>
+            </w:r>
+            <w:proofErr w:type="spellEnd"/>
+            <w:r>
+              <w:rPr>
+                <w:rFonts w:ascii="Times New Roman" w:hAnsi="Times New Roman" w:cs="Times New Roman"/>
+                <w:sz w:val="24"/>
+              </w:rPr>
+              <w:t xml:space="preserve"> </w:t>
+            </w:r>
+          </w:p>
+          <w:p>
+            <w:pPr>
+              <w:rPr>
+                <w:rFonts w:ascii="Times New Roman" w:hAnsi="Times New Roman" w:cs="Times New Roman"/>
+                <w:sz w:val="24"/>
+              </w:rPr>
+            </w:pPr>
+            <w:r>
+              <w:rPr>
+                <w:rFonts w:ascii="Times New Roman" w:hAnsi="Times New Roman" w:cs="Times New Roman"/>
+                <w:sz w:val="24"/>
+              </w:rPr>
+              <w:t xml:space="preserve">3. Вызвать </w:t>
+            </w:r>
+            <w:r>
+              <w:rPr>
+                <w:rFonts w:ascii="Times New Roman" w:hAnsi="Times New Roman" w:cs="Times New Roman"/>
+                <w:sz w:val="24"/>
+                <w:lang w:val="en-US"/>
+              </w:rPr>
+              <w:t>dump</w:t>
+            </w:r>
+            <w:r>
+              <w:rPr>
+                <w:rFonts w:ascii="Times New Roman" w:hAnsi="Times New Roman" w:cs="Times New Roman"/>
+                <w:sz w:val="24"/>
+              </w:rPr>
+              <w:t>_</w:t>
+            </w:r>
+            <w:proofErr w:type="spellStart"/>
+            <w:r>
+              <w:rPr>
+                <w:rFonts w:ascii="Times New Roman" w:hAnsi="Times New Roman" w:cs="Times New Roman"/>
+                <w:sz w:val="24"/>
+                <w:lang w:val="en-US"/>
+              </w:rPr>
+              <w:t>json</w:t>
+            </w:r>
+            <w:proofErr w:type="spellEnd"/>
+          </w:p>
+        </w:tc>
+        <w:tc>
+          <w:tcPr>
+            <w:tcW w:w="3115" w:type="dxa"/>
+            <w:shd w:val="clear" w:color="auto" w:fill="92D050"/>
+          </w:tcPr>
+          <w:p>
+            <w:pPr>
+              <w:rPr>
+                <w:rFonts w:ascii="Times New Roman" w:hAnsi="Times New Roman" w:cs="Times New Roman"/>
+                <w:sz w:val="24"/>
+              </w:rPr>
+            </w:pPr>
+            <w:r>
+              <w:rPr>
+                <w:rFonts w:ascii="Times New Roman" w:hAnsi="Times New Roman" w:cs="Times New Roman"/>
+                <w:sz w:val="24"/>
+              </w:rPr>
+              <w:t>JSON файл создае</w:t>
+            </w:r>
+            <w:r>
+              <w:rPr>
+                <w:rFonts w:ascii="Times New Roman" w:hAnsi="Times New Roman" w:cs="Times New Roman"/>
+                <w:sz w:val="24"/>
+              </w:rPr>
+              <w:t>тся и содержит заголовок и комментарии</w:t>
+            </w:r>
+          </w:p>
+        </w:tc>
+      </w:tr>
+      <w:tr>
+        <w:tc>
+          <w:tcPr>
+            <w:tcW w:w="3115" w:type="dxa"/>
+            <w:shd w:val="clear" w:color="auto" w:fill="92D050"/>
+          </w:tcPr>
+          <w:p>
+            <w:pPr>
+              <w:rPr>
+                <w:rFonts w:ascii="Times New Roman" w:hAnsi="Times New Roman" w:cs="Times New Roman"/>
+                <w:sz w:val="24"/>
+              </w:rPr>
+            </w:pPr>
+            <w:r>
+              <w:rPr>
+                <w:rFonts w:ascii="Times New Roman" w:hAnsi="Times New Roman" w:cs="Times New Roman"/>
+                <w:sz w:val="24"/>
+              </w:rPr>
+              <w:t>Полный сценарий с анализом AI</w:t>
+            </w:r>
+          </w:p>
+        </w:tc>
+        <w:tc>
+          <w:tcPr>
+            <w:tcW w:w="3115" w:type="dxa"/>
+            <w:shd w:val="clear" w:color="auto" w:fill="92D050"/>
+          </w:tcPr>
+          <w:p>
+            <w:pPr>
+              <w:rPr>
+                <w:rFonts w:ascii="Times New Roman" w:hAnsi="Times New Roman" w:cs="Times New Roman"/>
+                <w:sz w:val="24"/>
+              </w:rPr>
+            </w:pPr>
+            <w:r>
+              <w:rPr>
+                <w:rFonts w:ascii="Times New Roman" w:hAnsi="Times New Roman" w:cs="Times New Roman"/>
+                <w:sz w:val="24"/>
+              </w:rPr>
+              <w:t>1. Загрузить</w:t>
+            </w:r>
+            <w:r>
+              <w:rPr>
+                <w:rFonts w:ascii="Times New Roman" w:hAnsi="Times New Roman" w:cs="Times New Roman"/>
+                <w:sz w:val="24"/>
+              </w:rPr>
+              <w:t xml:space="preserve"> страницу с комментариями </w:t>
+            </w:r>
+          </w:p>
+          <w:p>
+            <w:pPr>
+              <w:rPr>
+                <w:rFonts w:ascii="Times New Roman" w:hAnsi="Times New Roman" w:cs="Times New Roman"/>
+                <w:sz w:val="24"/>
+              </w:rPr>
+            </w:pPr>
+            <w:r>
+              <w:rPr>
+                <w:rFonts w:ascii="Times New Roman" w:hAnsi="Times New Roman" w:cs="Times New Roman"/>
+                <w:sz w:val="24"/>
+              </w:rPr>
+              <w:t xml:space="preserve">2. </w:t>
+            </w:r>
+            <w:r>
+              <w:rPr>
+                <w:rFonts w:ascii="Times New Roman" w:hAnsi="Times New Roman" w:cs="Times New Roman"/>
+                <w:sz w:val="24"/>
+              </w:rPr>
+              <w:t>Загрузить</w:t>
+            </w:r>
+            <w:r>
+              <w:rPr>
+                <w:rFonts w:ascii="Times New Roman" w:hAnsi="Times New Roman" w:cs="Times New Roman"/>
+                <w:sz w:val="24"/>
+              </w:rPr>
+              <w:t xml:space="preserve"> </w:t>
+            </w:r>
+            <w:r>
+              <w:rPr>
+                <w:rFonts w:ascii="Times New Roman" w:hAnsi="Times New Roman" w:cs="Times New Roman"/>
+                <w:sz w:val="24"/>
+                <w:lang w:val="en-US"/>
+              </w:rPr>
+              <w:t>is</w:t>
+            </w:r>
+            <w:r>
+              <w:rPr>
+                <w:rFonts w:ascii="Times New Roman" w:hAnsi="Times New Roman" w:cs="Times New Roman"/>
+                <w:sz w:val="24"/>
+              </w:rPr>
+              <w:t>_</w:t>
+            </w:r>
+            <w:proofErr w:type="spellStart"/>
+            <w:r>
+              <w:rPr>
+                <w:rFonts w:ascii="Times New Roman" w:hAnsi="Times New Roman" w:cs="Times New Roman"/>
+                <w:sz w:val="24"/>
+                <w:lang w:val="en-US"/>
+              </w:rPr>
+              <w:t>ai</w:t>
+            </w:r>
+            <w:proofErr w:type="spellEnd"/>
+            <w:r>
+              <w:rPr>
+                <w:rFonts w:ascii="Times New Roman" w:hAnsi="Times New Roman" w:cs="Times New Roman"/>
+                <w:sz w:val="24"/>
+              </w:rPr>
+              <w:t>_</w:t>
+            </w:r>
+            <w:proofErr w:type="spellStart"/>
+            <w:r>
+              <w:rPr>
+                <w:rFonts w:ascii="Times New Roman" w:hAnsi="Times New Roman" w:cs="Times New Roman"/>
+                <w:sz w:val="24"/>
+                <w:lang w:val="en-US"/>
+              </w:rPr>
+              <w:t>russian</w:t>
+            </w:r>
+            <w:proofErr w:type="spellEnd"/>
+          </w:p>
+          <w:p>
+            <w:pPr>
+              <w:rPr>
+                <w:rFonts w:ascii="Times New Roman" w:hAnsi="Times New Roman" w:cs="Times New Roman"/>
+                <w:sz w:val="24"/>
+                <w:lang w:val="en-US"/>
+              </w:rPr>
+            </w:pPr>
+            <w:r>
+              <w:rPr>
+                <w:rFonts w:ascii="Times New Roman" w:hAnsi="Times New Roman" w:cs="Times New Roman"/>
+                <w:sz w:val="24"/>
+                <w:lang w:val="en-US"/>
+              </w:rPr>
+              <w:t xml:space="preserve">3. </w:t>
+            </w:r>
+            <w:r>
+              <w:rPr>
+                <w:rFonts w:ascii="Times New Roman" w:hAnsi="Times New Roman" w:cs="Times New Roman"/>
+                <w:sz w:val="24"/>
+              </w:rPr>
+              <w:t>Вызвать</w:t>
+            </w:r>
+            <w:r>
+              <w:rPr>
+                <w:rFonts w:ascii="Times New Roman" w:hAnsi="Times New Roman" w:cs="Times New Roman"/>
+                <w:sz w:val="24"/>
+                <w:lang w:val="en-US"/>
+              </w:rPr>
+              <w:t xml:space="preserve"> </w:t>
+            </w:r>
+            <w:r>
+              <w:rPr>
+                <w:rFonts w:ascii="Times New Roman" w:hAnsi="Times New Roman" w:cs="Times New Roman"/>
+                <w:sz w:val="24"/>
+                <w:lang w:val="en-US"/>
+              </w:rPr>
+              <w:t>lis</w:t>
+            </w:r>
+            <w:r>
+              <w:rPr>
+                <w:rFonts w:ascii="Times New Roman" w:hAnsi="Times New Roman" w:cs="Times New Roman"/>
+                <w:sz w:val="24"/>
+                <w:lang w:val="en-US"/>
+              </w:rPr>
+              <w:t>t_low_entropy</w:t>
+            </w:r>
+          </w:p>
+        </w:tc>
+        <w:tc>
+          <w:tcPr>
+            <w:tcW w:w="3115" w:type="dxa"/>
+            <w:shd w:val="clear" w:color="auto" w:fill="92D050"/>
+          </w:tcPr>
+          <w:p>
+            <w:pPr>
+              <w:rPr>
+                <w:rFonts w:ascii="Times New Roman" w:hAnsi="Times New Roman" w:cs="Times New Roman"/>
+                <w:sz w:val="24"/>
+                <w:lang w:val="en-US"/>
+              </w:rPr>
+            </w:pPr>
+            <w:r>
+              <w:rPr>
+                <w:rFonts w:ascii="Times New Roman" w:hAnsi="Times New Roman" w:cs="Times New Roman"/>
+                <w:sz w:val="24"/>
+                <w:lang w:val="en-US"/>
+              </w:rPr>
+              <w:t xml:space="preserve">В </w:t>
+            </w:r>
+            <w:proofErr w:type="spellStart"/>
+            <w:r>
+              <w:rPr>
+                <w:rFonts w:ascii="Times New Roman" w:hAnsi="Times New Roman" w:cs="Times New Roman"/>
+                <w:sz w:val="24"/>
+                <w:lang w:val="en-US"/>
+              </w:rPr>
+              <w:t>консоль</w:t>
+            </w:r>
+            <w:proofErr w:type="spellEnd"/>
+            <w:r>
+              <w:rPr>
+                <w:rFonts w:ascii="Times New Roman" w:hAnsi="Times New Roman" w:cs="Times New Roman"/>
+                <w:sz w:val="24"/>
+                <w:lang w:val="en-US"/>
+              </w:rPr>
+              <w:t xml:space="preserve"> </w:t>
+            </w:r>
+            <w:proofErr w:type="spellStart"/>
+            <w:r>
+              <w:rPr>
+                <w:rFonts w:ascii="Times New Roman" w:hAnsi="Times New Roman" w:cs="Times New Roman"/>
+                <w:sz w:val="24"/>
+                <w:lang w:val="en-US"/>
+              </w:rPr>
+              <w:t>выводится</w:t>
+            </w:r>
+            <w:proofErr w:type="spellEnd"/>
+            <w:r>
+              <w:rPr>
+                <w:rFonts w:ascii="Times New Roman" w:hAnsi="Times New Roman" w:cs="Times New Roman"/>
+                <w:sz w:val="24"/>
+                <w:lang w:val="en-US"/>
+              </w:rPr>
+              <w:t xml:space="preserve"> </w:t>
+            </w:r>
+            <w:proofErr w:type="spellStart"/>
+            <w:r>
+              <w:rPr>
+                <w:rFonts w:ascii="Times New Roman" w:hAnsi="Times New Roman" w:cs="Times New Roman"/>
+                <w:sz w:val="24"/>
+                <w:lang w:val="en-US"/>
+              </w:rPr>
+              <w:t>предупреждение</w:t>
+            </w:r>
+            <w:proofErr w:type="spellEnd"/>
+          </w:p>
+        </w:tc>
+      </w:tr>
+      <w:tr>
+        <w:tc>
+          <w:tcPr>
+            <w:tcW w:w="3115" w:type="dxa"/>
+            <w:shd w:val="clear" w:color="auto" w:fill="92D050"/>
+          </w:tcPr>
+          <w:p>
+            <w:pPr>
+              <w:rPr>
+                <w:rFonts w:ascii="Times New Roman" w:hAnsi="Times New Roman" w:cs="Times New Roman"/>
+                <w:sz w:val="24"/>
+                <w:lang w:val="en-US"/>
+              </w:rPr>
+            </w:pPr>
+            <w:proofErr w:type="spellStart"/>
+            <w:r>
+              <w:rPr>
+                <w:rFonts w:ascii="Times New Roman" w:hAnsi="Times New Roman" w:cs="Times New Roman"/>
+                <w:sz w:val="24"/>
+                <w:lang w:val="en-US"/>
+              </w:rPr>
+              <w:t>Работа</w:t>
+            </w:r>
+            <w:proofErr w:type="spellEnd"/>
+            <w:r>
+              <w:rPr>
+                <w:rFonts w:ascii="Times New Roman" w:hAnsi="Times New Roman" w:cs="Times New Roman"/>
+                <w:sz w:val="24"/>
+                <w:lang w:val="en-US"/>
+              </w:rPr>
+              <w:t xml:space="preserve"> </w:t>
+            </w:r>
+            <w:proofErr w:type="spellStart"/>
+            <w:r>
+              <w:rPr>
+                <w:rFonts w:ascii="Times New Roman" w:hAnsi="Times New Roman" w:cs="Times New Roman"/>
+                <w:sz w:val="24"/>
+                <w:lang w:val="en-US"/>
+              </w:rPr>
+              <w:t>через</w:t>
+            </w:r>
+            <w:proofErr w:type="spellEnd"/>
+            <w:r>
+              <w:rPr>
+                <w:rFonts w:ascii="Times New Roman" w:hAnsi="Times New Roman" w:cs="Times New Roman"/>
+                <w:sz w:val="24"/>
+                <w:lang w:val="en-US"/>
+              </w:rPr>
+              <w:t xml:space="preserve"> </w:t>
+            </w:r>
+            <w:proofErr w:type="spellStart"/>
+            <w:r>
+              <w:rPr>
+                <w:rFonts w:ascii="Times New Roman" w:hAnsi="Times New Roman" w:cs="Times New Roman"/>
+                <w:sz w:val="24"/>
+                <w:lang w:val="en-US"/>
+              </w:rPr>
+              <w:t>Config</w:t>
+            </w:r>
+            <w:proofErr w:type="spellEnd"/>
+          </w:p>
+        </w:tc>
+        <w:tc>
+          <w:tcPr>
+            <w:tcW w:w="3115" w:type="dxa"/>
+            <w:shd w:val="clear" w:color="auto" w:fill="92D050"/>
+          </w:tcPr>
+          <w:p>
+            <w:pPr>
+              <w:rPr>
+                <w:rFonts w:ascii="Times New Roman" w:hAnsi="Times New Roman" w:cs="Times New Roman"/>
+                <w:sz w:val="24"/>
+              </w:rPr>
+            </w:pPr>
+            <w:r>
+              <w:rPr>
+                <w:rFonts w:ascii="Times New Roman" w:hAnsi="Times New Roman" w:cs="Times New Roman"/>
+                <w:sz w:val="24"/>
+              </w:rPr>
+              <w:t xml:space="preserve">1. Создать временный </w:t>
+            </w:r>
+            <w:r>
+              <w:rPr>
+                <w:rFonts w:ascii="Times New Roman" w:hAnsi="Times New Roman" w:cs="Times New Roman"/>
+                <w:sz w:val="24"/>
+                <w:lang w:val="en-US"/>
+              </w:rPr>
+              <w:t>config</w:t>
+            </w:r>
+            <w:r>
+              <w:rPr>
+                <w:rFonts w:ascii="Times New Roman" w:hAnsi="Times New Roman" w:cs="Times New Roman"/>
+                <w:sz w:val="24"/>
+              </w:rPr>
+              <w:t>.</w:t>
+            </w:r>
+            <w:r>
+              <w:rPr>
+                <w:rFonts w:ascii="Times New Roman" w:hAnsi="Times New Roman" w:cs="Times New Roman"/>
+                <w:sz w:val="24"/>
+                <w:lang w:val="en-US"/>
+              </w:rPr>
+              <w:t>json</w:t>
+            </w:r>
+            <w:r>
+              <w:rPr>
+                <w:rFonts w:ascii="Times New Roman" w:hAnsi="Times New Roman" w:cs="Times New Roman"/>
+                <w:sz w:val="24"/>
+              </w:rPr>
+              <w:t xml:space="preserve"> </w:t>
+            </w:r>
+          </w:p>
+          <w:p>
+            <w:pPr>
+              <w:rPr>
+                <w:rFonts w:ascii="Times New Roman" w:hAnsi="Times New Roman" w:cs="Times New Roman"/>
+                <w:sz w:val="24"/>
+              </w:rPr>
+            </w:pPr>
+            <w:r>
+              <w:rPr>
+                <w:rFonts w:ascii="Times New Roman" w:hAnsi="Times New Roman" w:cs="Times New Roman"/>
+                <w:sz w:val="24"/>
+              </w:rPr>
+              <w:t xml:space="preserve">2. Использовать </w:t>
+            </w:r>
+            <w:r>
+              <w:rPr>
+                <w:rFonts w:ascii="Times New Roman" w:hAnsi="Times New Roman" w:cs="Times New Roman"/>
+                <w:sz w:val="24"/>
+                <w:lang w:val="en-US"/>
+              </w:rPr>
+              <w:t>config</w:t>
+            </w:r>
+            <w:r>
+              <w:rPr>
+                <w:rFonts w:ascii="Times New Roman" w:hAnsi="Times New Roman" w:cs="Times New Roman"/>
+                <w:sz w:val="24"/>
+              </w:rPr>
+              <w:t>["</w:t>
+            </w:r>
+            <w:r>
+              <w:rPr>
+                <w:rFonts w:ascii="Times New Roman" w:hAnsi="Times New Roman" w:cs="Times New Roman"/>
+                <w:sz w:val="24"/>
+                <w:lang w:val="en-US"/>
+              </w:rPr>
+              <w:t>url</w:t>
+            </w:r>
+            <w:r>
+              <w:rPr>
+                <w:rFonts w:ascii="Times New Roman" w:hAnsi="Times New Roman" w:cs="Times New Roman"/>
+                <w:sz w:val="24"/>
+              </w:rPr>
+              <w:t xml:space="preserve">"] </w:t>
+            </w:r>
+          </w:p>
+          <w:p>
+            <w:pPr>
+              <w:rPr>
+                <w:rFonts w:ascii="Times New Roman" w:hAnsi="Times New Roman" w:cs="Times New Roman"/>
+                <w:sz w:val="24"/>
+              </w:rPr>
+            </w:pPr>
+            <w:r>
+              <w:rPr>
+                <w:rFonts w:ascii="Times New Roman" w:hAnsi="Times New Roman" w:cs="Times New Roman"/>
+                <w:sz w:val="24"/>
+              </w:rPr>
+              <w:lastRenderedPageBreak/>
+              <w:t>3. Выполнить полный сценарий</w:t>
+            </w:r>
+          </w:p>
+        </w:tc>
+        <w:tc>
+          <w:tcPr>
+            <w:tcW w:w="3115" w:type="dxa"/>
+            <w:shd w:val="clear" w:color="auto" w:fill="92D050"/>
+          </w:tcPr>
+          <w:p>
+            <w:pPr>
+              <w:rPr>
+                <w:rFonts w:ascii="Times New Roman" w:hAnsi="Times New Roman" w:cs="Times New Roman"/>
+                <w:sz w:val="24"/>
+              </w:rPr>
+            </w:pPr>
+            <w:r>
+              <w:rPr>
+                <w:rFonts w:ascii="Times New Roman" w:hAnsi="Times New Roman" w:cs="Times New Roman"/>
+                <w:sz w:val="24"/>
+              </w:rPr>
+              <w:lastRenderedPageBreak/>
+              <w:t xml:space="preserve">Приложение работает с </w:t>
+            </w:r>
+            <w:proofErr w:type="spellStart"/>
+            <w:r>
+              <w:rPr>
+                <w:rFonts w:ascii="Times New Roman" w:hAnsi="Times New Roman" w:cs="Times New Roman"/>
+                <w:sz w:val="24"/>
+              </w:rPr>
+              <w:t>конфигом</w:t>
+            </w:r>
+            <w:proofErr w:type="spellEnd"/>
+          </w:p>
+        </w:tc>
+      </w:tr>
+      <w:tr>
+        <w:tc>
+          <w:tcPr>
+            <w:tcW w:w="3115" w:type="dxa"/>
+            <w:shd w:val="clear" w:color="auto" w:fill="92D050"/>
+          </w:tcPr>
+          <w:p>
+            <w:pPr>
+              <w:rPr>
+                <w:rFonts w:ascii="Times New Roman" w:hAnsi="Times New Roman" w:cs="Times New Roman"/>
+                <w:sz w:val="24"/>
+              </w:rPr>
+            </w:pPr>
+            <w:r>
+              <w:rPr>
+                <w:rFonts w:ascii="Times New Roman" w:hAnsi="Times New Roman" w:cs="Times New Roman"/>
+                <w:sz w:val="24"/>
+              </w:rPr>
+              <w:lastRenderedPageBreak/>
+              <w:t>Извлечение текста страницы</w:t>
+            </w:r>
+          </w:p>
+        </w:tc>
+        <w:tc>
+          <w:tcPr>
+            <w:tcW w:w="3115" w:type="dxa"/>
+            <w:shd w:val="clear" w:color="auto" w:fill="92D050"/>
+          </w:tcPr>
+          <w:p>
+            <w:pPr>
+              <w:rPr>
+                <w:rFonts w:ascii="Times New Roman" w:hAnsi="Times New Roman" w:cs="Times New Roman"/>
+                <w:sz w:val="24"/>
+              </w:rPr>
+            </w:pPr>
+            <w:r>
+              <w:rPr>
+                <w:rFonts w:ascii="Times New Roman" w:hAnsi="Times New Roman" w:cs="Times New Roman"/>
+                <w:sz w:val="24"/>
+              </w:rPr>
+              <w:t>1. Загрузить</w:t>
+            </w:r>
+            <w:r>
+              <w:rPr>
+                <w:rFonts w:ascii="Times New Roman" w:hAnsi="Times New Roman" w:cs="Times New Roman"/>
+                <w:sz w:val="24"/>
+              </w:rPr>
+              <w:t xml:space="preserve"> страницу </w:t>
+            </w:r>
+          </w:p>
+          <w:p>
+            <w:pPr>
+              <w:rPr>
+                <w:rFonts w:ascii="Times New Roman" w:hAnsi="Times New Roman" w:cs="Times New Roman"/>
+                <w:sz w:val="24"/>
+                <w:lang w:val="en-US"/>
+              </w:rPr>
+            </w:pPr>
+            <w:r>
+              <w:rPr>
+                <w:rFonts w:ascii="Times New Roman" w:hAnsi="Times New Roman" w:cs="Times New Roman"/>
+                <w:sz w:val="24"/>
+              </w:rPr>
+              <w:t>2. Вызвать</w:t>
+            </w:r>
+            <w:r>
+              <w:rPr>
+                <w:rFonts w:ascii="Times New Roman" w:hAnsi="Times New Roman" w:cs="Times New Roman"/>
+                <w:sz w:val="24"/>
+              </w:rPr>
+              <w:t xml:space="preserve"> </w:t>
+            </w:r>
+            <w:proofErr w:type="spellStart"/>
+            <w:r>
+              <w:rPr>
+                <w:rFonts w:ascii="Times New Roman" w:hAnsi="Times New Roman" w:cs="Times New Roman"/>
+                <w:sz w:val="24"/>
+              </w:rPr>
+              <w:t>extract_raw_text</w:t>
+            </w:r>
+            <w:proofErr w:type="spellEnd"/>
+          </w:p>
+        </w:tc>
+        <w:tc>
+          <w:tcPr>
+            <w:tcW w:w="3115" w:type="dxa"/>
+            <w:shd w:val="clear" w:color="auto" w:fill="92D050"/>
+          </w:tcPr>
+          <w:p>
+            <w:pPr>
+              <w:rPr>
+                <w:rFonts w:ascii="Times New Roman" w:hAnsi="Times New Roman" w:cs="Times New Roman"/>
+                <w:sz w:val="24"/>
+              </w:rPr>
+            </w:pPr>
+            <w:r>
+              <w:rPr>
+                <w:rFonts w:ascii="Times New Roman" w:hAnsi="Times New Roman" w:cs="Times New Roman"/>
+                <w:sz w:val="24"/>
+              </w:rPr>
+              <w:t>Возвращается очищенный текст страницы</w:t>
+            </w:r>
+          </w:p>
+        </w:tc>
+      </w:tr>
+    </w:tbl>
+    <w:p>
+      <w:pPr>
+        <w:rPr>
+          <w:rFonts w:ascii="Times New Roman" w:hAnsi="Times New Roman" w:cs="Times New Roman"/>
+          <w:sz w:val="24"/>
+        </w:rPr>
+      </w:pPr>
     </w:p>
     <w:sectPr>
       <w:pgSz w:w="11906" w:h="16838"/>

</xml_diff>

<commit_message>
add test api documentation
</commit_message>
<xml_diff>
--- a/tests/doc/test_cases.docx
+++ b/tests/doc/test_cases.docx
@@ -161,6 +161,7 @@
           <w:sz w:val="24"/>
         </w:rPr>
       </w:pPr>
+      <w:proofErr w:type="spellStart"/>
       <w:r>
         <w:rPr>
           <w:rFonts w:ascii="Times New Roman" w:hAnsi="Times New Roman" w:cs="Times New Roman"/>
@@ -169,6 +170,30 @@
         </w:rPr>
         <w:t>list_low_entropy</w:t>
       </w:r>
+      <w:proofErr w:type="spellEnd"/>
+    </w:p>
+    <w:p>
+      <w:pPr>
+        <w:pStyle w:val="a3"/>
+        <w:numPr>
+          <w:ilvl w:val="0"/>
+          <w:numId w:val="1"/>
+        </w:numPr>
+        <w:rPr>
+          <w:rFonts w:ascii="Times New Roman" w:hAnsi="Times New Roman" w:cs="Times New Roman"/>
+          <w:sz w:val="24"/>
+        </w:rPr>
+      </w:pPr>
+      <w:proofErr w:type="spellStart"/>
+      <w:r>
+        <w:rPr>
+          <w:rFonts w:ascii="Times New Roman" w:hAnsi="Times New Roman" w:cs="Times New Roman"/>
+          <w:sz w:val="24"/>
+          <w:lang w:val="en-US"/>
+        </w:rPr>
+        <w:t>endpoint_fastapi</w:t>
+      </w:r>
+      <w:proofErr w:type="spellEnd"/>
     </w:p>
     <w:p>
       <w:pPr>
@@ -1444,6 +1469,7 @@
                 <w:rFonts w:ascii="Times New Roman" w:hAnsi="Times New Roman" w:cs="Times New Roman"/>
                 <w:sz w:val="24"/>
               </w:rPr>
+              <w:lastRenderedPageBreak/>
               <w:t>Проверка корректности записи</w:t>
             </w:r>
           </w:p>
@@ -1522,7 +1548,6 @@
           <w:rFonts w:ascii="Times New Roman" w:hAnsi="Times New Roman" w:cs="Times New Roman"/>
           <w:sz w:val="24"/>
         </w:rPr>
-        <w:lastRenderedPageBreak/>
         <w:t xml:space="preserve">Тестирование </w:t>
       </w:r>
       <w:r>
@@ -2461,7 +2486,16 @@
                 <w:rFonts w:ascii="Times New Roman" w:hAnsi="Times New Roman" w:cs="Times New Roman"/>
                 <w:sz w:val="24"/>
               </w:rPr>
-              <w:t xml:space="preserve"> с обычным текстом</w:t>
+              <w:t xml:space="preserve"> с </w:t>
+            </w:r>
+            <w:bookmarkStart w:id="0" w:name="_GoBack"/>
+            <w:bookmarkEnd w:id="0"/>
+            <w:r>
+              <w:rPr>
+                <w:rFonts w:ascii="Times New Roman" w:hAnsi="Times New Roman" w:cs="Times New Roman"/>
+                <w:sz w:val="24"/>
+              </w:rPr>
+              <w:t>обычным текстом</w:t>
             </w:r>
           </w:p>
           <w:p>
@@ -2543,6 +2577,409 @@
                 <w:sz w:val="24"/>
               </w:rPr>
               <w:t>Функция возвращает строку с текстом страницы (без пустых строк и лишних пробелов)</w:t>
+            </w:r>
+          </w:p>
+        </w:tc>
+      </w:tr>
+    </w:tbl>
+    <w:p>
+      <w:pPr>
+        <w:rPr>
+          <w:rFonts w:ascii="Times New Roman" w:hAnsi="Times New Roman" w:cs="Times New Roman"/>
+          <w:sz w:val="24"/>
+        </w:rPr>
+      </w:pPr>
+    </w:p>
+    <w:p>
+      <w:pPr>
+        <w:jc w:val="center"/>
+        <w:rPr>
+          <w:rFonts w:ascii="Times New Roman" w:hAnsi="Times New Roman" w:cs="Times New Roman"/>
+          <w:sz w:val="24"/>
+          <w:lang w:val="en-US"/>
+        </w:rPr>
+      </w:pPr>
+      <w:r>
+        <w:rPr>
+          <w:rFonts w:ascii="Times New Roman" w:hAnsi="Times New Roman" w:cs="Times New Roman"/>
+          <w:sz w:val="24"/>
+        </w:rPr>
+        <w:t xml:space="preserve">Тестирование </w:t>
+      </w:r>
+      <w:proofErr w:type="spellStart"/>
+      <w:r>
+        <w:rPr>
+          <w:rFonts w:ascii="Times New Roman" w:hAnsi="Times New Roman" w:cs="Times New Roman"/>
+          <w:sz w:val="24"/>
+          <w:lang w:val="en-US"/>
+        </w:rPr>
+        <w:t>endpoint_fastapi</w:t>
+      </w:r>
+      <w:proofErr w:type="spellEnd"/>
+    </w:p>
+    <w:tbl>
+      <w:tblPr>
+        <w:tblStyle w:val="a4"/>
+        <w:tblW w:w="0" w:type="auto"/>
+        <w:tblLook w:val="04A0" w:firstRow="1" w:lastRow="0" w:firstColumn="1" w:lastColumn="0" w:noHBand="0" w:noVBand="1"/>
+      </w:tblPr>
+      <w:tblGrid>
+        <w:gridCol w:w="3115"/>
+        <w:gridCol w:w="3115"/>
+        <w:gridCol w:w="3115"/>
+      </w:tblGrid>
+      <w:tr>
+        <w:tc>
+          <w:tcPr>
+            <w:tcW w:w="3115" w:type="dxa"/>
+            <w:shd w:val="clear" w:color="auto" w:fill="92D050"/>
+          </w:tcPr>
+          <w:p>
+            <w:pPr>
+              <w:rPr>
+                <w:rFonts w:ascii="Times New Roman" w:hAnsi="Times New Roman" w:cs="Times New Roman"/>
+                <w:sz w:val="24"/>
+              </w:rPr>
+            </w:pPr>
+            <w:r>
+              <w:rPr>
+                <w:rFonts w:ascii="Times New Roman" w:hAnsi="Times New Roman" w:cs="Times New Roman"/>
+                <w:sz w:val="24"/>
+              </w:rPr>
+              <w:t>Получение инструкции по корневому пути</w:t>
+            </w:r>
+          </w:p>
+        </w:tc>
+        <w:tc>
+          <w:tcPr>
+            <w:tcW w:w="3115" w:type="dxa"/>
+            <w:shd w:val="clear" w:color="auto" w:fill="92D050"/>
+          </w:tcPr>
+          <w:p>
+            <w:pPr>
+              <w:rPr>
+                <w:rFonts w:ascii="Times New Roman" w:hAnsi="Times New Roman" w:cs="Times New Roman"/>
+                <w:sz w:val="24"/>
+              </w:rPr>
+            </w:pPr>
+            <w:r>
+              <w:rPr>
+                <w:rFonts w:ascii="Times New Roman" w:hAnsi="Times New Roman" w:cs="Times New Roman"/>
+                <w:sz w:val="24"/>
+              </w:rPr>
+              <w:t>1. Обращение</w:t>
+            </w:r>
+            <w:r>
+              <w:rPr>
+                <w:rFonts w:ascii="Times New Roman" w:hAnsi="Times New Roman" w:cs="Times New Roman"/>
+                <w:sz w:val="24"/>
+              </w:rPr>
+              <w:t xml:space="preserve"> к корню API (GET /)</w:t>
+            </w:r>
+          </w:p>
+        </w:tc>
+        <w:tc>
+          <w:tcPr>
+            <w:tcW w:w="3115" w:type="dxa"/>
+            <w:shd w:val="clear" w:color="auto" w:fill="92D050"/>
+          </w:tcPr>
+          <w:p>
+            <w:pPr>
+              <w:rPr>
+                <w:rFonts w:ascii="Times New Roman" w:hAnsi="Times New Roman" w:cs="Times New Roman"/>
+                <w:sz w:val="24"/>
+              </w:rPr>
+            </w:pPr>
+            <w:r>
+              <w:rPr>
+                <w:rFonts w:ascii="Times New Roman" w:hAnsi="Times New Roman" w:cs="Times New Roman"/>
+                <w:sz w:val="24"/>
+              </w:rPr>
+              <w:t xml:space="preserve">Возвращается </w:t>
+            </w:r>
+            <w:r>
+              <w:rPr>
+                <w:rFonts w:ascii="Times New Roman" w:hAnsi="Times New Roman" w:cs="Times New Roman"/>
+                <w:sz w:val="24"/>
+              </w:rPr>
+              <w:t>JSON с инструкцией</w:t>
+            </w:r>
+            <w:r>
+              <w:rPr>
+                <w:rFonts w:ascii="Times New Roman" w:hAnsi="Times New Roman" w:cs="Times New Roman"/>
+                <w:sz w:val="24"/>
+              </w:rPr>
+              <w:t xml:space="preserve"> о том, как использовать сервис</w:t>
+            </w:r>
+          </w:p>
+        </w:tc>
+      </w:tr>
+      <w:tr>
+        <w:tc>
+          <w:tcPr>
+            <w:tcW w:w="3115" w:type="dxa"/>
+            <w:shd w:val="clear" w:color="auto" w:fill="92D050"/>
+          </w:tcPr>
+          <w:p>
+            <w:pPr>
+              <w:rPr>
+                <w:rFonts w:ascii="Times New Roman" w:hAnsi="Times New Roman" w:cs="Times New Roman"/>
+                <w:sz w:val="24"/>
+              </w:rPr>
+            </w:pPr>
+            <w:r>
+              <w:rPr>
+                <w:rFonts w:ascii="Times New Roman" w:hAnsi="Times New Roman" w:cs="Times New Roman"/>
+                <w:sz w:val="24"/>
+              </w:rPr>
+              <w:t>Получение списка комментариев для существующей статьи</w:t>
+            </w:r>
+          </w:p>
+        </w:tc>
+        <w:tc>
+          <w:tcPr>
+            <w:tcW w:w="3115" w:type="dxa"/>
+            <w:shd w:val="clear" w:color="auto" w:fill="92D050"/>
+          </w:tcPr>
+          <w:p>
+            <w:pPr>
+              <w:rPr>
+                <w:rFonts w:ascii="Times New Roman" w:hAnsi="Times New Roman" w:cs="Times New Roman"/>
+                <w:sz w:val="24"/>
+              </w:rPr>
+            </w:pPr>
+            <w:r>
+              <w:rPr>
+                <w:rFonts w:ascii="Times New Roman" w:hAnsi="Times New Roman" w:cs="Times New Roman"/>
+                <w:sz w:val="24"/>
+              </w:rPr>
+              <w:t>П</w:t>
+            </w:r>
+            <w:r>
+              <w:rPr>
+                <w:rFonts w:ascii="Times New Roman" w:hAnsi="Times New Roman" w:cs="Times New Roman"/>
+                <w:sz w:val="24"/>
+              </w:rPr>
+              <w:t>ередает</w:t>
+            </w:r>
+            <w:r>
+              <w:rPr>
+                <w:rFonts w:ascii="Times New Roman" w:hAnsi="Times New Roman" w:cs="Times New Roman"/>
+                <w:sz w:val="24"/>
+              </w:rPr>
+              <w:t>ся</w:t>
+            </w:r>
+            <w:r>
+              <w:rPr>
+                <w:rFonts w:ascii="Times New Roman" w:hAnsi="Times New Roman" w:cs="Times New Roman"/>
+                <w:sz w:val="24"/>
+              </w:rPr>
+              <w:t xml:space="preserve"> чис</w:t>
+            </w:r>
+            <w:r>
+              <w:rPr>
+                <w:rFonts w:ascii="Times New Roman" w:hAnsi="Times New Roman" w:cs="Times New Roman"/>
+                <w:sz w:val="24"/>
+              </w:rPr>
+              <w:t xml:space="preserve">ловой идентификатор статьи </w:t>
+            </w:r>
+            <w:proofErr w:type="spellStart"/>
+            <w:r>
+              <w:rPr>
+                <w:rFonts w:ascii="Times New Roman" w:hAnsi="Times New Roman" w:cs="Times New Roman"/>
+                <w:sz w:val="24"/>
+              </w:rPr>
+              <w:t>Habr</w:t>
+            </w:r>
+            <w:proofErr w:type="spellEnd"/>
+            <w:r>
+              <w:rPr>
+                <w:rFonts w:ascii="Times New Roman" w:hAnsi="Times New Roman" w:cs="Times New Roman"/>
+                <w:sz w:val="24"/>
+              </w:rPr>
+              <w:t xml:space="preserve"> в </w:t>
+            </w:r>
+            <w:proofErr w:type="spellStart"/>
+            <w:r>
+              <w:rPr>
+                <w:rFonts w:ascii="Times New Roman" w:hAnsi="Times New Roman" w:cs="Times New Roman"/>
+                <w:sz w:val="24"/>
+              </w:rPr>
+              <w:t>эндпоинт</w:t>
+            </w:r>
+            <w:proofErr w:type="spellEnd"/>
+            <w:r>
+              <w:rPr>
+                <w:rFonts w:ascii="Times New Roman" w:hAnsi="Times New Roman" w:cs="Times New Roman"/>
+                <w:sz w:val="24"/>
+              </w:rPr>
+              <w:t xml:space="preserve"> GET /{</w:t>
+            </w:r>
+            <w:proofErr w:type="spellStart"/>
+            <w:r>
+              <w:rPr>
+                <w:rFonts w:ascii="Times New Roman" w:hAnsi="Times New Roman" w:cs="Times New Roman"/>
+                <w:sz w:val="24"/>
+              </w:rPr>
+              <w:t>habr_id</w:t>
+            </w:r>
+            <w:proofErr w:type="spellEnd"/>
+            <w:r>
+              <w:rPr>
+                <w:rFonts w:ascii="Times New Roman" w:hAnsi="Times New Roman" w:cs="Times New Roman"/>
+                <w:sz w:val="24"/>
+              </w:rPr>
+              <w:t>}</w:t>
+            </w:r>
+          </w:p>
+        </w:tc>
+        <w:tc>
+          <w:tcPr>
+            <w:tcW w:w="3115" w:type="dxa"/>
+            <w:shd w:val="clear" w:color="auto" w:fill="92D050"/>
+          </w:tcPr>
+          <w:p>
+            <w:pPr>
+              <w:rPr>
+                <w:rFonts w:ascii="Times New Roman" w:hAnsi="Times New Roman" w:cs="Times New Roman"/>
+                <w:sz w:val="24"/>
+              </w:rPr>
+            </w:pPr>
+            <w:r>
+              <w:rPr>
+                <w:rFonts w:ascii="Times New Roman" w:hAnsi="Times New Roman" w:cs="Times New Roman"/>
+                <w:sz w:val="24"/>
+              </w:rPr>
+              <w:t>Возвращается ответ</w:t>
+            </w:r>
+            <w:r>
+              <w:rPr>
+                <w:rFonts w:ascii="Times New Roman" w:hAnsi="Times New Roman" w:cs="Times New Roman"/>
+                <w:sz w:val="24"/>
+              </w:rPr>
+              <w:t xml:space="preserve"> с заголовком статьи и списком текстов комментариев</w:t>
+            </w:r>
+          </w:p>
+        </w:tc>
+      </w:tr>
+      <w:tr>
+        <w:tc>
+          <w:tcPr>
+            <w:tcW w:w="3115" w:type="dxa"/>
+            <w:shd w:val="clear" w:color="auto" w:fill="92D050"/>
+          </w:tcPr>
+          <w:p>
+            <w:pPr>
+              <w:rPr>
+                <w:rFonts w:ascii="Times New Roman" w:hAnsi="Times New Roman" w:cs="Times New Roman"/>
+                <w:sz w:val="24"/>
+              </w:rPr>
+            </w:pPr>
+            <w:r>
+              <w:rPr>
+                <w:rFonts w:ascii="Times New Roman" w:hAnsi="Times New Roman" w:cs="Times New Roman"/>
+                <w:sz w:val="24"/>
+              </w:rPr>
+              <w:t>Попытка получить комментарии с неверным ID или при отсутствии данных</w:t>
+            </w:r>
+          </w:p>
+        </w:tc>
+        <w:tc>
+          <w:tcPr>
+            <w:tcW w:w="3115" w:type="dxa"/>
+            <w:shd w:val="clear" w:color="auto" w:fill="92D050"/>
+          </w:tcPr>
+          <w:p>
+            <w:pPr>
+              <w:rPr>
+                <w:rFonts w:ascii="Times New Roman" w:hAnsi="Times New Roman" w:cs="Times New Roman"/>
+                <w:sz w:val="24"/>
+              </w:rPr>
+            </w:pPr>
+            <w:r>
+              <w:rPr>
+                <w:rFonts w:ascii="Times New Roman" w:hAnsi="Times New Roman" w:cs="Times New Roman"/>
+                <w:sz w:val="24"/>
+              </w:rPr>
+              <w:t>П</w:t>
+            </w:r>
+            <w:r>
+              <w:rPr>
+                <w:rFonts w:ascii="Times New Roman" w:hAnsi="Times New Roman" w:cs="Times New Roman"/>
+                <w:sz w:val="24"/>
+              </w:rPr>
+              <w:t>ередает</w:t>
+            </w:r>
+            <w:r>
+              <w:rPr>
+                <w:rFonts w:ascii="Times New Roman" w:hAnsi="Times New Roman" w:cs="Times New Roman"/>
+                <w:sz w:val="24"/>
+              </w:rPr>
+              <w:t>ся</w:t>
+            </w:r>
+            <w:r>
+              <w:rPr>
+                <w:rFonts w:ascii="Times New Roman" w:hAnsi="Times New Roman" w:cs="Times New Roman"/>
+                <w:sz w:val="24"/>
+              </w:rPr>
+              <w:t xml:space="preserve"> ID статьи</w:t>
+            </w:r>
+            <w:r>
+              <w:rPr>
+                <w:rFonts w:ascii="Times New Roman" w:hAnsi="Times New Roman" w:cs="Times New Roman"/>
+                <w:sz w:val="24"/>
+              </w:rPr>
+              <w:t xml:space="preserve"> в </w:t>
+            </w:r>
+            <w:r>
+              <w:rPr>
+                <w:rFonts w:ascii="Times New Roman" w:hAnsi="Times New Roman" w:cs="Times New Roman"/>
+                <w:sz w:val="24"/>
+                <w:lang w:val="en-US"/>
+              </w:rPr>
+              <w:t>GET</w:t>
+            </w:r>
+            <w:r>
+              <w:rPr>
+                <w:rFonts w:ascii="Times New Roman" w:hAnsi="Times New Roman" w:cs="Times New Roman"/>
+                <w:sz w:val="24"/>
+              </w:rPr>
+              <w:t>, которая не существует или у которой нет блока комментариев</w:t>
+            </w:r>
+          </w:p>
+        </w:tc>
+        <w:tc>
+          <w:tcPr>
+            <w:tcW w:w="3115" w:type="dxa"/>
+            <w:shd w:val="clear" w:color="auto" w:fill="92D050"/>
+          </w:tcPr>
+          <w:p>
+            <w:pPr>
+              <w:rPr>
+                <w:rFonts w:ascii="Times New Roman" w:hAnsi="Times New Roman" w:cs="Times New Roman"/>
+                <w:sz w:val="24"/>
+              </w:rPr>
+            </w:pPr>
+            <w:r>
+              <w:rPr>
+                <w:rFonts w:ascii="Times New Roman" w:hAnsi="Times New Roman" w:cs="Times New Roman"/>
+                <w:sz w:val="24"/>
+              </w:rPr>
+              <w:t>Возвращается ответ с заголовком</w:t>
+            </w:r>
+            <w:r>
+              <w:rPr>
+                <w:rFonts w:ascii="Times New Roman" w:hAnsi="Times New Roman" w:cs="Times New Roman"/>
+                <w:sz w:val="24"/>
+              </w:rPr>
+              <w:t xml:space="preserve"> статьи</w:t>
+            </w:r>
+            <w:r>
+              <w:rPr>
+                <w:rFonts w:ascii="Times New Roman" w:hAnsi="Times New Roman" w:cs="Times New Roman"/>
+                <w:sz w:val="24"/>
+              </w:rPr>
+              <w:t xml:space="preserve"> и пустым списком комментариев</w:t>
             </w:r>
           </w:p>
         </w:tc>
@@ -2587,6 +3024,7 @@
           <w:rFonts w:ascii="Times New Roman" w:hAnsi="Times New Roman" w:cs="Times New Roman"/>
           <w:sz w:val="24"/>
         </w:rPr>
+        <w:lastRenderedPageBreak/>
         <w:t xml:space="preserve">Проверить, что приложение работает как единая система: </w:t>
       </w:r>
       <w:proofErr w:type="spellStart"/>
@@ -2619,16 +3057,7 @@
           <w:rFonts w:ascii="Times New Roman" w:hAnsi="Times New Roman" w:cs="Times New Roman"/>
           <w:sz w:val="24"/>
         </w:rPr>
-        <w:t xml:space="preserve"> комментарие</w:t>
-      </w:r>
-      <w:bookmarkStart w:id="0" w:name="_GoBack"/>
-      <w:bookmarkEnd w:id="0"/>
-      <w:r>
-        <w:rPr>
-          <w:rFonts w:ascii="Times New Roman" w:hAnsi="Times New Roman" w:cs="Times New Roman"/>
-          <w:sz w:val="24"/>
-        </w:rPr>
-        <w:t xml:space="preserve">в - анализ - </w:t>
+        <w:t xml:space="preserve"> комментариев - анализ - </w:t>
       </w:r>
       <w:r>
         <w:rPr>
@@ -2735,6 +3164,7 @@
               </w:rPr>
               <w:t xml:space="preserve">2. Вызвать </w:t>
             </w:r>
+            <w:proofErr w:type="spellStart"/>
             <w:r>
               <w:rPr>
                 <w:rFonts w:ascii="Times New Roman" w:hAnsi="Times New Roman" w:cs="Times New Roman"/>
@@ -2743,6 +3173,7 @@
               </w:rPr>
               <w:t>habr</w:t>
             </w:r>
+            <w:proofErr w:type="spellEnd"/>
             <w:r>
               <w:rPr>
                 <w:rFonts w:ascii="Times New Roman" w:hAnsi="Times New Roman" w:cs="Times New Roman"/>
@@ -3291,7 +3722,6 @@
                 <w:rFonts w:ascii="Times New Roman" w:hAnsi="Times New Roman" w:cs="Times New Roman"/>
                 <w:sz w:val="24"/>
               </w:rPr>
-              <w:lastRenderedPageBreak/>
               <w:t>3. Выполнить полный сценарий</w:t>
             </w:r>
           </w:p>
@@ -3313,7 +3743,6 @@
                 <w:rFonts w:ascii="Times New Roman" w:hAnsi="Times New Roman" w:cs="Times New Roman"/>
                 <w:sz w:val="24"/>
               </w:rPr>
-              <w:lastRenderedPageBreak/>
               <w:t xml:space="preserve">Приложение работает с </w:t>
             </w:r>
             <w:proofErr w:type="spellStart"/>
@@ -3346,7 +3775,6 @@
                 <w:rFonts w:ascii="Times New Roman" w:hAnsi="Times New Roman" w:cs="Times New Roman"/>
                 <w:sz w:val="24"/>
               </w:rPr>
-              <w:lastRenderedPageBreak/>
               <w:t>Извлечение текста страницы</w:t>
             </w:r>
           </w:p>
@@ -3383,7 +3811,6 @@
               <w:rPr>
                 <w:rFonts w:ascii="Times New Roman" w:hAnsi="Times New Roman" w:cs="Times New Roman"/>
                 <w:sz w:val="24"/>
-                <w:lang w:val="en-US"/>
               </w:rPr>
             </w:pPr>
             <w:r>

</xml_diff>